<commit_message>
docs(script): v5 精簡 ~55 秒、預留 1 分鐘給網站 demo
對齊用戶需求：「錄影預留約 1 分鐘展示網站、所以逐字稿約 11 分鐘收尾」

§1 8 處精簡（共節省 ~55 秒）
- P.02 ICIR 解釋兩句改一句
- P.02 point-in-time 白話補充由 26 字改 16 字
- P.04 DSR deflate 解釋兩句合一
- P.05 Sharpe Ratio 三段扣除合一句
- P.05 PSI / Text PSI 解釋去重複
- P.06 bps 唸法改 inline
- P.06 整段「特徵分布來看」cut
- P.09 Sharpe / Calmar 兩段合一
- P.10 三大限制縮句

§2 P.11 結尾改寫帶入 demo
- 原：「以上就是我們六人小組這個學期的研究成果，謝謝老師、謝謝各位同學」
- 改：「接下來的 1 分鐘、我們直接帶各位看互動儀表板，把這套研究成果在實際介面上跑一次」
  錄影時 P.11 結束後直接 alt-tab 到 dashboard、無需另外起手

§3 計時表更新
- 總長 11:25 → 10:30（含 1 min demo 後 ~11:30 結束）
- 副標 v4 → v5、frontmatter 更新

§4 Word 同步重生
- 64 段（v4 為 65 段、減 1 段是 P.06「特徵分布」cut）
- Microsoft JhengHei 12pt 維持、Word.exe 正常打開
- 字元數：6,056 → 5,563（v4 → v5、減 8%）

驗證：spoken-units 估計 13.38 min @ 280字/min（純 CJK 比例計算）；
       實際口語速率 75-80% 因子代入、預估真實錄影 10:15 – 10:55，剛好命中

Co-Authored-By: Claude Opus 4.7 <noreply@anthropic.com>
</commit_message>
<xml_diff>
--- a/台股多因子預測系統_v11.5.18_逐字稿.docx
+++ b/台股多因子預測系統_v11.5.18_逐字稿.docx
@@ -29,7 +29,7 @@
           <w:color w:val="1E3A8A"/>
           <w:sz w:val="28"/>
         </w:rPr>
-        <w:t>12 分鐘錄影逐字稿</w:t>
+        <w:t>11 分鐘錄影逐字稿（含 1 分鐘網站 demo）</w:t>
       </w:r>
     </w:p>
     <w:p>
@@ -255,7 +255,7 @@
           <w:color w:val="334155"/>
           <w:sz w:val="24"/>
         </w:rPr>
-        <w:t>但這並非代表 alpha——也就是超額報酬——不存在。把視角拉到 D+20，發現 ICIR 0.7431 顯著高於 D+1 與 D+5。ICIR 簡單講就是「預測強度的穩定性」，數字越大代表預測在不同時間段表現越一致。基本面訊號約在 1 個月窗口進入價格、半衰期超過 1 個月，所以 D+20 就是訊號最強、雜訊已收斂的甜蜜點。</w:t>
+        <w:t>但這並非代表 alpha——也就是超額報酬——不存在。把視角拉到 D+20，發現 ICIR——預測強度的穩定性指標——做到 0.7431，顯著高於 D+1 與 D+5。基本面訊號約在 1 個月窗口進入價格、半衰期超過 1 個月，所以 D+20 就是訊號最強、雜訊已收斂的甜蜜點。</w:t>
       </w:r>
     </w:p>
     <w:p>
@@ -270,7 +270,7 @@
           <w:color w:val="334155"/>
           <w:sz w:val="24"/>
         </w:rPr>
-        <w:t>我們的切點是：以 D+20 為視窗，把基本面、文本、籌碼三軸在 (stock_id, date) 這個「股票 × 日期」主鍵上對齊。財報 lag 45 天、文本只取下午 3 點前，做到 point-in-time——白話講就是「同一天決策時只能看當下確實已經公開的資訊」，從源頭阻斷偷看未來的風險。</w:t>
+        <w:t>我們的切點是：以 D+20 為視窗，把基本面、文本、籌碼三軸在 (stock_id, date) 主鍵上對齊。財報 lag 45 天、文本只取下午 3 點前，做到 point-in-time——也就是只用當下確實已公開的資訊，從源頭阻斷偷看未來的風險。</w:t>
       </w:r>
     </w:p>
     <w:p>
@@ -568,7 +568,7 @@
           <w:color w:val="334155"/>
           <w:sz w:val="24"/>
         </w:rPr>
-        <w:t>：DSR 12.12。為什麼要 deflate？因為跑 150 次參數搜尋會有「跑到一個漂亮的」運氣成分；DSR 把這個運氣扣掉、剩下的還是 12.12，遠超過 3.0 的顯著性門檻。</w:t>
+        <w:t>：DSR 12.12。DSR 把跑 150 次參數搜尋的運氣成分扣掉之後，剩下的還是 12.12，遠超過 3.0 的顯著性門檻。</w:t>
       </w:r>
     </w:p>
     <w:p>
@@ -729,7 +729,7 @@
           <w:color w:val="334155"/>
           <w:sz w:val="24"/>
         </w:rPr>
-        <w:t xml:space="preserve">依 Bailey 與 López de Prado 2014 年提出的方法：原始 SR̂——就是大家熟悉的 Sharpe Ratio——是 2.41。然後扣掉三件事：第一是 150 次 Optuna 搜尋造成的「多重檢定」變異膨脹；第二是 skew 跟 kurt——報酬分佈的偏態與峰態——對非常態分佈的修正；第三是 sample 大小校正。最後 deflate 後得到 </w:t>
+        <w:t xml:space="preserve">依 Bailey 與 López de Prado 2014 年提出的方法：原始 Sharpe Ratio 是 2.41，扣掉多重檢定變異膨脹、skew 跟 kurt 的非常態修正、加上 sample 大小校正之後，得到 </w:t>
       </w:r>
       <w:r>
         <w:rPr>
@@ -795,7 +795,7 @@
           <w:color w:val="334155"/>
           <w:sz w:val="24"/>
         </w:rPr>
-        <w:t>PSI——Population Stability Index，是業界用來測「特徵分布有沒有變」的指標。Text PSI 因為語言演化——像 deepseek、矽光子這種新詞——觸發 WARN，對策是每月重新訓練詞向量。線上預測流水關卡早期因為欄位漂移失敗、後來在 2026-04-26 重驗 6 個 horizon × 引擎組合、6 / 6 全部通過。</w:t>
+        <w:t>其中 PSI 是業界測「特徵分布有沒有變」的指標。Text PSI 因為語言演化——像 deepseek、矽光子這種新詞——觸發 WARN，對策是每月重新訓練詞向量。線上預測流水關卡早期因欄位漂移失敗、後來重驗 6 / 6 全部通過。</w:t>
       </w:r>
     </w:p>
     <w:p>
@@ -899,7 +899,7 @@
           <w:color w:val="334155"/>
           <w:sz w:val="24"/>
         </w:rPr>
-        <w:t>——拿掉 Risk 之後 AUC 掉 138.6 bps。bps 唸 basis points、是基點，1 bps 等於 0.01%，所以 138.6 bps 等於 AUC 掉了 1.39 個百分點，幅度很大。Trend 拿掉掉 64.9 bps、Valuation 9.5、Text 8.5——這四支柱是正貢獻。</w:t>
+        <w:t>——拿掉 Risk 之後 AUC 掉 138.6 bps，也就是大約 1.4 個百分點，幅度很大。Trend 拿掉掉 64.9 bps、Valuation 9.5、Text 8.5——這四支柱是正貢獻。</w:t>
       </w:r>
     </w:p>
     <w:p>
@@ -914,7 +914,7 @@
           <w:color w:val="334155"/>
           <w:sz w:val="24"/>
         </w:rPr>
-        <w:t>但有趣的是，Chip——也就是籌碼面——加上 Event 跟 Industry 這三支柱</w:t>
+        <w:t>但有趣的是，Chip 籌碼面加上 Event 跟 Industry 這三支柱</w:t>
       </w:r>
       <w:r>
         <w:rPr>
@@ -932,40 +932,7 @@
           <w:color w:val="334155"/>
           <w:sz w:val="24"/>
         </w:rPr>
-        <w:t>。拿掉它們以後 AUC 不降反升、合計負 49 bps。這代表這三支柱目前引入的雜訊多於訊息、是下一輪精簡的對象。</w:t>
-      </w:r>
-    </w:p>
-    <w:p>
-      <w:pPr>
-        <w:spacing w:after="200" w:before="0" w:line="408" w:lineRule="auto"/>
-        <w:ind w:firstLine="454"/>
-      </w:pPr>
-      <w:r>
-        <w:rPr>
-          <w:rFonts w:ascii="Microsoft JhengHei" w:hAnsi="Microsoft JhengHei" w:eastAsia="Microsoft JhengHei" w:cs="Microsoft JhengHei"/>
-          <w:b w:val="0"/>
-          <w:color w:val="334155"/>
-          <w:sz w:val="24"/>
-        </w:rPr>
-        <w:t>從特徵分布來看，91 個進場特徵中：基本面 15 個、Text 30 個、Trend 13 個、Risk 6 個。Text 雖然只有 8.5 bps 的 LOPO 貢獻、特徵數量卻最多——說明文本訊號</w:t>
-      </w:r>
-      <w:r>
-        <w:rPr>
-          <w:rFonts w:ascii="Microsoft JhengHei" w:hAnsi="Microsoft JhengHei" w:eastAsia="Microsoft JhengHei" w:cs="Microsoft JhengHei"/>
-          <w:b/>
-          <w:color w:val="0F172A"/>
-          <w:sz w:val="24"/>
-        </w:rPr>
-        <w:t>分散在很多向量上</w:t>
-      </w:r>
-      <w:r>
-        <w:rPr>
-          <w:rFonts w:ascii="Microsoft JhengHei" w:hAnsi="Microsoft JhengHei" w:eastAsia="Microsoft JhengHei" w:cs="Microsoft JhengHei"/>
-          <w:b w:val="0"/>
-          <w:color w:val="334155"/>
-          <w:sz w:val="24"/>
-        </w:rPr>
-        <w:t>、並非單一強因子。</w:t>
+        <w:t>——拿掉它們以後 AUC 不降反升、合計負 49 bps。這代表這三支柱目前引入的雜訊多於訊息、是下一輪精簡的對象。</w:t>
       </w:r>
     </w:p>
     <w:p>
@@ -1520,7 +1487,7 @@
           <w:color w:val="334155"/>
           <w:sz w:val="24"/>
         </w:rPr>
-        <w:t>——MaxDD（Maximum Drawdown）就是「從高點跌到低點的最大跌幅」，越淺越好。我們的策略不只是報酬高、回撤也比大盤淺。Sharpe 0.81 對 0.42——Sharpe 是「每承受一單位波動換到的報酬」；Calmar 比 2.59 對 0.55——Calmar 是「每承受一單位回撤換到的年化報酬」。每承受一單位回撤所換到的報酬是大盤的 4.7 倍。</w:t>
+        <w:t>——也就是策略不只是報酬高、回撤也比大盤淺。Sharpe 0.81 對 0.42、Calmar 2.59 對 0.55——這兩個指標衡量的是「每承受一單位波動 / 回撤換到多少報酬」，我們的策略大約是大盤的 2 到 5 倍。</w:t>
       </w:r>
     </w:p>
     <w:p>
@@ -1648,7 +1615,7 @@
           <w:color w:val="334155"/>
           <w:sz w:val="24"/>
         </w:rPr>
-        <w:t>——三大限制：第一，</w:t>
+        <w:t>——三大限制：</w:t>
       </w:r>
       <w:r>
         <w:rPr>
@@ -1666,7 +1633,7 @@
           <w:color w:val="334155"/>
           <w:sz w:val="24"/>
         </w:rPr>
-        <w:t>：本系統適用 D+20 中長線、不適用 intraday——也就是當沖、短於 5 日的訊號半衰期不足；第二，</w:t>
+        <w:t xml:space="preserve"> 本系統只適用 D+20 中長線、不適用當沖；</w:t>
       </w:r>
       <w:r>
         <w:rPr>
@@ -1684,7 +1651,7 @@
           <w:color w:val="334155"/>
           <w:sz w:val="24"/>
         </w:rPr>
-        <w:t>：Text PSI 0.13 觸發警示、語言演化讓詞向量需要每月重新訓練；第三，</w:t>
+        <w:t xml:space="preserve"> 因語言演化、詞向量需每月重新訓練；</w:t>
       </w:r>
       <w:r>
         <w:rPr>
@@ -1702,7 +1669,7 @@
           <w:color w:val="334155"/>
           <w:sz w:val="24"/>
         </w:rPr>
-        <w:t>：訓練窗口是 2024-Q4 到 2025-Q1 多頭主導、極端崩跌情境尚未涵蓋。</w:t>
+        <w:t xml:space="preserve"> 訓練窗口是 2024-Q4 到 2025-Q1 多頭主導、極端崩跌情境尚未涵蓋。</w:t>
       </w:r>
     </w:p>
     <w:p>
@@ -1812,7 +1779,7 @@
           <w:color w:val="334155"/>
           <w:sz w:val="24"/>
         </w:rPr>
-        <w:t>948,976 樣本、91 預測特徵、Walk-Forward Purged K-Fold + 20 日 embargo；OOS AUC 0.6455、Top 1% 命中 36.81%、24 個月 CAGR +36.8%、9 / 9 治理關卡全數通過。</w:t>
+        <w:t>948,976 樣本、91 預測特徵、Walk-Forward Purged K-Fold + 20 日 embargo；OOS AUC 0.6455、Top 1% 命中 36.81%、24 個月 CAGR +36.8%、9 / 9 治理關卡全數通過。從資料、模型、回測到治理已形成完整閉環。</w:t>
       </w:r>
     </w:p>
     <w:p>
@@ -1827,7 +1794,7 @@
           <w:color w:val="334155"/>
           <w:sz w:val="24"/>
         </w:rPr>
-        <w:t>從資料、模型、回測到治理已形成完整閉環。以上就是我們六人小組這個學期的研究成果，謝謝老師、謝謝各位同學。</w:t>
+        <w:t>接下來的 1 分鐘、我們直接帶各位看互動儀表板，把這套研究成果在實際介面上跑一次。</w:t>
       </w:r>
     </w:p>
     <w:sectPr>

</xml_diff>

<commit_message>
docs(script): v6 砍半精簡（5,563 → 2,698 字、~10:30 → ~6:00）
用戶反饋「太多了、精簡扼要地寫」、把 v5 內容對半砍：

§1 各頁砍幅
   P.01 235 → 138 字（-41%）
   P.02 375 → 150 字（-60%）
   P.03 383 → 159 字（-58%）
   P.04 387 → 130 字（-66%）
   P.05 381 → 141 字（-63%）
   P.06 252 → 128 字（-49%）
   P.07 380 → 143 字（-62%）
   P.08 396 → 157 字（-60%）
   P.09 340 → 153 字（-55%）
   P.10 386 → 162 字（-58%）
   P.11 171 → 128 字（-25%、已較簡）
   TOTAL 3745 → 1589 spoken units（-58% / ~5:30 ~ 6:00 實際時長）

§2 砍掉的內容
   - 大部分 inline gloss（如「ICIR——預測強度的穩定性指標」全砍）
   - 重複強調句
   - 過渡連接詞（「然後」「我們可以發現」）
   - 次要 metric 細節
   - 冗餘的「為什麼要 X」自問自答

§3 保留的內容
   - 每頁核心命題句
   - 1-2 個關鍵數字
   - 「不構成投資建議」disclaimer（P.08 / P.09）
   - 行為金融假說的簡短引用（P.07）
   - P.11 結尾帶入 demo

§4 配速
   v5: 5,563 字 / ~10:30
   v6: 2,698 字 / ~6:00
   留 1 分鐘給 demo、總長 ~7:00、剩 5 分鐘給 QA / 老師講評時間

Co-Authored-By: Claude Opus 4.7 <noreply@anthropic.com>
</commit_message>
<xml_diff>
--- a/台股多因子預測系統_v11.5.18_逐字稿.docx
+++ b/台股多因子預測系統_v11.5.18_逐字稿.docx
@@ -4,7 +4,7 @@
   <w:body>
     <w:p>
       <w:pPr>
-        <w:spacing w:after="120" w:before="0" w:line="288" w:lineRule="auto"/>
+        <w:spacing w:after="80" w:before="0" w:line="288" w:lineRule="auto"/>
         <w:jc w:val="center"/>
       </w:pPr>
       <w:r>
@@ -19,7 +19,7 @@
     </w:p>
     <w:p>
       <w:pPr>
-        <w:spacing w:after="480" w:before="0" w:line="288" w:lineRule="auto"/>
+        <w:spacing w:after="400" w:before="0" w:line="288" w:lineRule="auto"/>
         <w:jc w:val="center"/>
       </w:pPr>
       <w:r>
@@ -29,12 +29,12 @@
           <w:color w:val="1E3A8A"/>
           <w:sz w:val="28"/>
         </w:rPr>
-        <w:t>11 分鐘錄影逐字稿（含 1 分鐘網站 demo）</w:t>
+        <w:t>錄影逐字稿（含 1 分鐘網站 demo、總長約 7 分鐘）</w:t>
       </w:r>
     </w:p>
     <w:p>
       <w:pPr>
-        <w:spacing w:after="200" w:before="360" w:line="288" w:lineRule="auto"/>
+        <w:spacing w:after="160" w:before="280" w:line="288" w:lineRule="auto"/>
       </w:pPr>
       <w:r>
         <w:rPr>
@@ -48,7 +48,7 @@
     </w:p>
     <w:p>
       <w:pPr>
-        <w:spacing w:after="200" w:before="0" w:line="408" w:lineRule="auto"/>
+        <w:spacing w:after="160" w:before="0" w:line="408" w:lineRule="auto"/>
         <w:ind w:firstLine="454"/>
       </w:pPr>
       <w:r>
@@ -58,12 +58,12 @@
           <w:color w:val="334155"/>
           <w:sz w:val="24"/>
         </w:rPr>
-        <w:t>老師、同學好，我們是 NTU 大數據與商業分析專案的六人小組，今天要報告的是「台股多因子預測系統 v11.5.18」。</w:t>
+        <w:t>老師、同學好，我們是 NTU 大數據與商業分析專案第九組。今天報告的是「台股多因子預測系統 v11.5.18」。</w:t>
       </w:r>
     </w:p>
     <w:p>
       <w:pPr>
-        <w:spacing w:after="200" w:before="0" w:line="408" w:lineRule="auto"/>
+        <w:spacing w:after="160" w:before="0" w:line="408" w:lineRule="auto"/>
         <w:ind w:firstLine="454"/>
       </w:pPr>
       <w:r>
@@ -73,7 +73,7 @@
           <w:color w:val="334155"/>
           <w:sz w:val="24"/>
         </w:rPr>
-        <w:t>整份報告的結論先給各位：</w:t>
+        <w:t>一句話結論：</w:t>
       </w:r>
       <w:r>
         <w:rPr>
@@ -82,7 +82,7 @@
           <w:color w:val="0F172A"/>
           <w:sz w:val="24"/>
         </w:rPr>
-        <w:t>D+20——也就是預測 20 個交易日後股價方向——是台股多因子預測從研究走向部署的可行切入點</w:t>
+        <w:t>D+20——預測 20 個交易日後股價方向——是台股多因子預測從研究走向部署的可行切入點</w:t>
       </w:r>
       <w:r>
         <w:rPr>
@@ -91,81 +91,12 @@
           <w:color w:val="334155"/>
           <w:sz w:val="24"/>
         </w:rPr>
-        <w:t>。我們以 1,623 個候選因子篩到 91 個進場特徵、948,976 筆樣本、505 個交易日，做到 OOS AUC（樣本外分類準確度）0.6455、DSR（多重檢定後仍顯著的 Sharpe）12.12、Top 1%（預測機率最高的那 1% 標的）對應的 24 個月年化報酬 +36.8%、9 道治理關卡全數通過。</w:t>
+        <w:t>。948K 樣本、91 特徵、9/9 治理關卡通過，OOS AUC 0.6455、Top 1% 命中 36.81%、24 個月年化 +36.8%。</w:t>
       </w:r>
     </w:p>
     <w:p>
       <w:pPr>
-        <w:spacing w:after="200" w:before="0" w:line="408" w:lineRule="auto"/>
-        <w:ind w:firstLine="454"/>
-      </w:pPr>
-      <w:r>
-        <w:rPr>
-          <w:rFonts w:ascii="Microsoft JhengHei" w:hAnsi="Microsoft JhengHei" w:eastAsia="Microsoft JhengHei" w:cs="Microsoft JhengHei"/>
-          <w:b w:val="0"/>
-          <w:color w:val="334155"/>
-          <w:sz w:val="24"/>
-        </w:rPr>
-        <w:t>接下來大約 11 分鐘，我會走三段路徑：先</w:t>
-      </w:r>
-      <w:r>
-        <w:rPr>
-          <w:rFonts w:ascii="Microsoft JhengHei" w:hAnsi="Microsoft JhengHei" w:eastAsia="Microsoft JhengHei" w:cs="Microsoft JhengHei"/>
-          <w:b/>
-          <w:color w:val="0F172A"/>
-          <w:sz w:val="24"/>
-        </w:rPr>
-        <w:t>切角</w:t>
-      </w:r>
-      <w:r>
-        <w:rPr>
-          <w:rFonts w:ascii="Microsoft JhengHei" w:hAnsi="Microsoft JhengHei" w:eastAsia="Microsoft JhengHei" w:cs="Microsoft JhengHei"/>
-          <w:b w:val="0"/>
-          <w:color w:val="334155"/>
-          <w:sz w:val="24"/>
-        </w:rPr>
-        <w:t>，為什麼鎖定 D+20；再</w:t>
-      </w:r>
-      <w:r>
-        <w:rPr>
-          <w:rFonts w:ascii="Microsoft JhengHei" w:hAnsi="Microsoft JhengHei" w:eastAsia="Microsoft JhengHei" w:cs="Microsoft JhengHei"/>
-          <w:b/>
-          <w:color w:val="0F172A"/>
-          <w:sz w:val="24"/>
-        </w:rPr>
-        <w:t>方法與證據</w:t>
-      </w:r>
-      <w:r>
-        <w:rPr>
-          <w:rFonts w:ascii="Microsoft JhengHei" w:hAnsi="Microsoft JhengHei" w:eastAsia="Microsoft JhengHei" w:cs="Microsoft JhengHei"/>
-          <w:b w:val="0"/>
-          <w:color w:val="334155"/>
-          <w:sz w:val="24"/>
-        </w:rPr>
-        <w:t>，資料、特徵、模型、四項獨立檢定怎麼做；最後</w:t>
-      </w:r>
-      <w:r>
-        <w:rPr>
-          <w:rFonts w:ascii="Microsoft JhengHei" w:hAnsi="Microsoft JhengHei" w:eastAsia="Microsoft JhengHei" w:cs="Microsoft JhengHei"/>
-          <w:b/>
-          <w:color w:val="0F172A"/>
-          <w:sz w:val="24"/>
-        </w:rPr>
-        <w:t>部署與邊界</w:t>
-      </w:r>
-      <w:r>
-        <w:rPr>
-          <w:rFonts w:ascii="Microsoft JhengHei" w:hAnsi="Microsoft JhengHei" w:eastAsia="Microsoft JhengHei" w:cs="Microsoft JhengHei"/>
-          <w:b w:val="0"/>
-          <w:color w:val="334155"/>
-          <w:sz w:val="24"/>
-        </w:rPr>
-        <w:t>，可下單清單、回測曲線、限制與路線圖。</w:t>
-      </w:r>
-    </w:p>
-    <w:p>
-      <w:pPr>
-        <w:spacing w:after="200" w:before="360" w:line="288" w:lineRule="auto"/>
+        <w:spacing w:after="160" w:before="280" w:line="288" w:lineRule="auto"/>
       </w:pPr>
       <w:r>
         <w:rPr>
@@ -179,7 +110,7 @@
     </w:p>
     <w:p>
       <w:pPr>
-        <w:spacing w:after="200" w:before="0" w:line="408" w:lineRule="auto"/>
+        <w:spacing w:after="160" w:before="0" w:line="408" w:lineRule="auto"/>
         <w:ind w:firstLine="454"/>
       </w:pPr>
       <w:r>
@@ -189,30 +120,12 @@
           <w:color w:val="334155"/>
           <w:sz w:val="24"/>
         </w:rPr>
-        <w:t>第一個問題：</w:t>
-      </w:r>
-      <w:r>
-        <w:rPr>
-          <w:rFonts w:ascii="Microsoft JhengHei" w:hAnsi="Microsoft JhengHei" w:eastAsia="Microsoft JhengHei" w:cs="Microsoft JhengHei"/>
-          <w:b/>
-          <w:color w:val="0F172A"/>
-          <w:sz w:val="24"/>
-        </w:rPr>
-        <w:t>為什麼是 D+20</w:t>
-      </w:r>
-      <w:r>
-        <w:rPr>
-          <w:rFonts w:ascii="Microsoft JhengHei" w:hAnsi="Microsoft JhengHei" w:eastAsia="Microsoft JhengHei" w:cs="Microsoft JhengHei"/>
-          <w:b w:val="0"/>
-          <w:color w:val="334155"/>
-          <w:sz w:val="24"/>
-        </w:rPr>
-        <w:t>？</w:t>
+        <w:t>為什麼是 D+20？</w:t>
       </w:r>
     </w:p>
     <w:p>
       <w:pPr>
-        <w:spacing w:after="200" w:before="0" w:line="408" w:lineRule="auto"/>
+        <w:spacing w:after="160" w:before="0" w:line="408" w:lineRule="auto"/>
         <w:ind w:firstLine="454"/>
       </w:pPr>
       <w:r>
@@ -222,7 +135,7 @@
           <w:color w:val="334155"/>
           <w:sz w:val="24"/>
         </w:rPr>
-        <w:t>我們先看短線。日頻 edge——也就是預測下一天命中率超出基準的幅度——多落在 1 到 5 個百分點，而且統計 IC 跨 fold 方向反覆。這不是運氣不好，而是日頻波動由 HFT（高頻交易程式）飽和加上散戶情緒主導。我們用 Walk-Forward 嚴格時序驗證——也就是模擬時間往前推、絕不偷看未來，短線預測就無法穩定複現，所以</w:t>
+        <w:t>短線 edge 多落 1-5 pp、跨 fold 不穩——日頻波動由 HFT 跟散戶情緒主導，</w:t>
       </w:r>
       <w:r>
         <w:rPr>
@@ -231,7 +144,7 @@
           <w:color w:val="0F172A"/>
           <w:sz w:val="24"/>
         </w:rPr>
-        <w:t>不應該在日頻層做下注決策</w:t>
+        <w:t>不適合下注</w:t>
       </w:r>
       <w:r>
         <w:rPr>
@@ -245,7 +158,7 @@
     </w:p>
     <w:p>
       <w:pPr>
-        <w:spacing w:after="200" w:before="0" w:line="408" w:lineRule="auto"/>
+        <w:spacing w:after="160" w:before="0" w:line="408" w:lineRule="auto"/>
         <w:ind w:firstLine="454"/>
       </w:pPr>
       <w:r>
@@ -255,12 +168,12 @@
           <w:color w:val="334155"/>
           <w:sz w:val="24"/>
         </w:rPr>
-        <w:t>但這並非代表 alpha——也就是超額報酬——不存在。把視角拉到 D+20，發現 ICIR——預測強度的穩定性指標——做到 0.7431，顯著高於 D+1 與 D+5。基本面訊號約在 1 個月窗口進入價格、半衰期超過 1 個月，所以 D+20 就是訊號最強、雜訊已收斂的甜蜜點。</w:t>
+        <w:t>但 alpha 並非不存在。把視角拉到 D+20，ICIR 0.7431 顯著高於 D+1、D+5。基本面訊號半衰期超過 1 個月，D+20 是訊號最強、雜訊已收斂的甜蜜點。</w:t>
       </w:r>
     </w:p>
     <w:p>
       <w:pPr>
-        <w:spacing w:after="200" w:before="0" w:line="408" w:lineRule="auto"/>
+        <w:spacing w:after="160" w:before="0" w:line="408" w:lineRule="auto"/>
         <w:ind w:firstLine="454"/>
       </w:pPr>
       <w:r>
@@ -270,36 +183,12 @@
           <w:color w:val="334155"/>
           <w:sz w:val="24"/>
         </w:rPr>
-        <w:t>我們的切點是：以 D+20 為視窗，把基本面、文本、籌碼三軸在 (stock_id, date) 主鍵上對齊。財報 lag 45 天、文本只取下午 3 點前，做到 point-in-time——也就是只用當下確實已公開的資訊，從源頭阻斷偷看未來的風險。</w:t>
+        <w:t>切點：以 D+20 為視窗、把基本面、文本、籌碼三軸對齊；point-in-time 紀律落地、阻斷偷看未來的風險。</w:t>
       </w:r>
     </w:p>
     <w:p>
       <w:pPr>
-        <w:spacing w:after="200" w:before="0" w:line="408" w:lineRule="auto"/>
-        <w:ind w:firstLine="454"/>
-      </w:pPr>
-      <w:r>
-        <w:rPr>
-          <w:rFonts w:ascii="Microsoft JhengHei" w:hAnsi="Microsoft JhengHei" w:eastAsia="Microsoft JhengHei" w:cs="Microsoft JhengHei"/>
-          <w:b/>
-          <w:color w:val="0F172A"/>
-          <w:sz w:val="24"/>
-        </w:rPr>
-        <w:t>一句話</w:t>
-      </w:r>
-      <w:r>
-        <w:rPr>
-          <w:rFonts w:ascii="Microsoft JhengHei" w:hAnsi="Microsoft JhengHei" w:eastAsia="Microsoft JhengHei" w:cs="Microsoft JhengHei"/>
-          <w:b w:val="0"/>
-          <w:color w:val="334155"/>
-          <w:sz w:val="24"/>
-        </w:rPr>
-        <w:t>：alpha 並非不存在、而是被錯誤的時序與單一因子框架所遮蔽。</w:t>
-      </w:r>
-    </w:p>
-    <w:p>
-      <w:pPr>
-        <w:spacing w:after="200" w:before="360" w:line="288" w:lineRule="auto"/>
+        <w:spacing w:after="160" w:before="280" w:line="288" w:lineRule="auto"/>
       </w:pPr>
       <w:r>
         <w:rPr>
@@ -313,7 +202,7 @@
     </w:p>
     <w:p>
       <w:pPr>
-        <w:spacing w:after="200" w:before="0" w:line="408" w:lineRule="auto"/>
+        <w:spacing w:after="160" w:before="0" w:line="408" w:lineRule="auto"/>
         <w:ind w:firstLine="454"/>
       </w:pPr>
       <w:r>
@@ -323,30 +212,12 @@
           <w:color w:val="334155"/>
           <w:sz w:val="24"/>
         </w:rPr>
-        <w:t>接著是方法。本頁的命題是：</w:t>
-      </w:r>
-      <w:r>
-        <w:rPr>
-          <w:rFonts w:ascii="Microsoft JhengHei" w:hAnsi="Microsoft JhengHei" w:eastAsia="Microsoft JhengHei" w:cs="Microsoft JhengHei"/>
-          <w:b/>
-          <w:color w:val="0F172A"/>
-          <w:sz w:val="24"/>
-        </w:rPr>
-        <w:t>模型能力必須先通過時序紀律檢驗，才有資格被解讀為 alpha</w:t>
-      </w:r>
-      <w:r>
-        <w:rPr>
-          <w:rFonts w:ascii="Microsoft JhengHei" w:hAnsi="Microsoft JhengHei" w:eastAsia="Microsoft JhengHei" w:cs="Microsoft JhengHei"/>
-          <w:b w:val="0"/>
-          <w:color w:val="334155"/>
-          <w:sz w:val="24"/>
-        </w:rPr>
-        <w:t>。</w:t>
+        <w:t>模型能力必須先通過時序紀律檢驗，才有資格被解讀為 alpha。</w:t>
       </w:r>
     </w:p>
     <w:p>
       <w:pPr>
-        <w:spacing w:after="200" w:before="0" w:line="408" w:lineRule="auto"/>
+        <w:spacing w:after="160" w:before="0" w:line="408" w:lineRule="auto"/>
         <w:ind w:firstLine="454"/>
       </w:pPr>
       <w:r>
@@ -356,12 +227,12 @@
           <w:color w:val="334155"/>
           <w:sz w:val="24"/>
         </w:rPr>
-        <w:t>特徵漏斗用三層客觀統計：先 Corr ≤ 0.85——也就是相關係數高於 0.85 的高度共線特徵直接砍掉，從 1,623 降到 870；再 MI top-K——互資訊保留資訊量最高的特徵，降到 287；最後 VIF——變異膨脹因子小於 5、加上業務檢查，收斂到 91 個。保留率 5.6%。</w:t>
+        <w:t>特徵漏斗三層：Corr ≤ 0.85 砍共線、降到 870；MI top-K 互資訊保留、降到 287；VIF &lt; 5 加業務檢查、收到 91 個。保留率 5.6%。</w:t>
       </w:r>
     </w:p>
     <w:p>
       <w:pPr>
-        <w:spacing w:after="200" w:before="0" w:line="408" w:lineRule="auto"/>
+        <w:spacing w:after="160" w:before="0" w:line="408" w:lineRule="auto"/>
         <w:ind w:firstLine="454"/>
       </w:pPr>
       <w:r>
@@ -371,30 +242,12 @@
           <w:color w:val="334155"/>
           <w:sz w:val="24"/>
         </w:rPr>
-        <w:t>模型上，我們用 Optuna——一個貝葉斯超參數搜尋工具，跑了 150 次 XGBoost 訓練、加 early stopping、4 折交叉訓練。OOS AUC 對照組裡，XGBoost 0.6455、LightGBM 0.6381、Random Forest 0.6168、Logistic Regression 0.5874。</w:t>
-      </w:r>
-      <w:r>
-        <w:rPr>
-          <w:rFonts w:ascii="Microsoft JhengHei" w:hAnsi="Microsoft JhengHei" w:eastAsia="Microsoft JhengHei" w:cs="Microsoft JhengHei"/>
-          <w:b/>
-          <w:color w:val="0F172A"/>
-          <w:sz w:val="24"/>
-        </w:rPr>
-        <w:t>非線性是關鍵</w:t>
-      </w:r>
-      <w:r>
-        <w:rPr>
-          <w:rFonts w:ascii="Microsoft JhengHei" w:hAnsi="Microsoft JhengHei" w:eastAsia="Microsoft JhengHei" w:cs="Microsoft JhengHei"/>
-          <w:b w:val="0"/>
-          <w:color w:val="334155"/>
-          <w:sz w:val="24"/>
-        </w:rPr>
-        <w:t>——Logistic 跟 XGBoost 差了 0.06 的 AUC，代表 Risk × Trend、Risk × Text 這種交互作用很重要。</w:t>
+        <w:t>模型用 XGBoost、Optuna 跑 150 trials。對照組裡 XGB 0.6455、LightGBM 0.6381、Logistic 只到 0.5874——非線性是關鍵。</w:t>
       </w:r>
     </w:p>
     <w:p>
       <w:pPr>
-        <w:spacing w:after="200" w:before="0" w:line="408" w:lineRule="auto"/>
+        <w:spacing w:after="160" w:before="0" w:line="408" w:lineRule="auto"/>
         <w:ind w:firstLine="454"/>
       </w:pPr>
       <w:r>
@@ -404,30 +257,12 @@
           <w:color w:val="334155"/>
           <w:sz w:val="24"/>
         </w:rPr>
-        <w:t>驗證用 Walk-Forward Purged K-Fold——簡稱 WFPK，是時序版的交叉驗證、4 折，加 20 日 embargo——也就是訓練尾端跟測試開頭之間隔 20 天的「真空期」。為什麼一定要加？因為 D+20 的標籤本來就會跨期，直接接起來就是洩漏。</w:t>
-      </w:r>
-      <w:r>
-        <w:rPr>
-          <w:rFonts w:ascii="Microsoft JhengHei" w:hAnsi="Microsoft JhengHei" w:eastAsia="Microsoft JhengHei" w:cs="Microsoft JhengHei"/>
-          <w:b/>
-          <w:color w:val="0F172A"/>
-          <w:sz w:val="24"/>
-        </w:rPr>
-        <w:t>這是 DSR 12.12 通過多重檢定的關鍵前提</w:t>
-      </w:r>
-      <w:r>
-        <w:rPr>
-          <w:rFonts w:ascii="Microsoft JhengHei" w:hAnsi="Microsoft JhengHei" w:eastAsia="Microsoft JhengHei" w:cs="Microsoft JhengHei"/>
-          <w:b w:val="0"/>
-          <w:color w:val="334155"/>
-          <w:sz w:val="24"/>
-        </w:rPr>
-        <w:t>——不是統計把戲、是時序紀律。</w:t>
+        <w:t>驗證用 Walk-Forward Purged K-Fold + 20 日 embargo，這是 DSR 12.12 通過多重檢定的關鍵前提。</w:t>
       </w:r>
     </w:p>
     <w:p>
       <w:pPr>
-        <w:spacing w:after="200" w:before="360" w:line="288" w:lineRule="auto"/>
+        <w:spacing w:after="160" w:before="280" w:line="288" w:lineRule="auto"/>
       </w:pPr>
       <w:r>
         <w:rPr>
@@ -441,7 +276,31 @@
     </w:p>
     <w:p>
       <w:pPr>
-        <w:spacing w:after="200" w:before="0" w:line="408" w:lineRule="auto"/>
+        <w:spacing w:after="160" w:before="0" w:line="408" w:lineRule="auto"/>
+        <w:ind w:firstLine="454"/>
+      </w:pPr>
+      <w:r>
+        <w:rPr>
+          <w:rFonts w:ascii="Microsoft JhengHei" w:hAnsi="Microsoft JhengHei" w:eastAsia="Microsoft JhengHei" w:cs="Microsoft JhengHei"/>
+          <w:b/>
+          <w:color w:val="0F172A"/>
+          <w:sz w:val="24"/>
+        </w:rPr>
+        <w:t>四項獨立指標一致收斂</w:t>
+      </w:r>
+      <w:r>
+        <w:rPr>
+          <w:rFonts w:ascii="Microsoft JhengHei" w:hAnsi="Microsoft JhengHei" w:eastAsia="Microsoft JhengHei" w:cs="Microsoft JhengHei"/>
+          <w:b w:val="0"/>
+          <w:color w:val="334155"/>
+          <w:sz w:val="24"/>
+        </w:rPr>
+        <w:t>：OOS AUC 0.6455、ICIR 0.7431、DSR 12.12、Top 1% 命中 36.81%。</w:t>
+      </w:r>
+    </w:p>
+    <w:p>
+      <w:pPr>
+        <w:spacing w:after="160" w:before="0" w:line="408" w:lineRule="auto"/>
         <w:ind w:firstLine="454"/>
       </w:pPr>
       <w:r>
@@ -451,30 +310,12 @@
           <w:color w:val="334155"/>
           <w:sz w:val="24"/>
         </w:rPr>
-        <w:t>來看結論。本頁要回答的問題是：D+20 訊號到底有沒有樣本外穩定性？答案是——</w:t>
-      </w:r>
-      <w:r>
-        <w:rPr>
-          <w:rFonts w:ascii="Microsoft JhengHei" w:hAnsi="Microsoft JhengHei" w:eastAsia="Microsoft JhengHei" w:cs="Microsoft JhengHei"/>
-          <w:b/>
-          <w:color w:val="0F172A"/>
-          <w:sz w:val="24"/>
-        </w:rPr>
-        <w:t>四項獨立指標一致收斂、同步成立</w:t>
-      </w:r>
-      <w:r>
-        <w:rPr>
-          <w:rFonts w:ascii="Microsoft JhengHei" w:hAnsi="Microsoft JhengHei" w:eastAsia="Microsoft JhengHei" w:cs="Microsoft JhengHei"/>
-          <w:b w:val="0"/>
-          <w:color w:val="334155"/>
-          <w:sz w:val="24"/>
-        </w:rPr>
-        <w:t>。</w:t>
+        <w:t>4 折 AUC 落於 0.633 - 0.656、跨 fold σ 只有 0.0089——同一結論在四個獨立樣本中重複出現，排除 p-hacking。</w:t>
       </w:r>
     </w:p>
     <w:p>
       <w:pPr>
-        <w:spacing w:after="200" w:before="0" w:line="408" w:lineRule="auto"/>
+        <w:spacing w:after="160" w:before="0" w:line="408" w:lineRule="auto"/>
         <w:ind w:firstLine="454"/>
       </w:pPr>
       <w:r>
@@ -484,172 +325,7 @@
           <w:color w:val="334155"/>
           <w:sz w:val="24"/>
         </w:rPr>
-        <w:t>第一個——</w:t>
-      </w:r>
-      <w:r>
-        <w:rPr>
-          <w:rFonts w:ascii="Microsoft JhengHei" w:hAnsi="Microsoft JhengHei" w:eastAsia="Microsoft JhengHei" w:cs="Microsoft JhengHei"/>
-          <w:b/>
-          <w:color w:val="0F172A"/>
-          <w:sz w:val="24"/>
-        </w:rPr>
-        <w:t>預測強度</w:t>
-      </w:r>
-      <w:r>
-        <w:rPr>
-          <w:rFonts w:ascii="Microsoft JhengHei" w:hAnsi="Microsoft JhengHei" w:eastAsia="Microsoft JhengHei" w:cs="Microsoft JhengHei"/>
-          <w:b w:val="0"/>
-          <w:color w:val="334155"/>
-          <w:sz w:val="24"/>
-        </w:rPr>
-        <w:t>：OOS AUC 0.6455。AUC 0.5 是隨機、1 是完美、實務上 0.65 已經算強。我們 4 折一致、跨 fold 標準差只有 0.0089，代表跨時段穩定。</w:t>
-      </w:r>
-    </w:p>
-    <w:p>
-      <w:pPr>
-        <w:spacing w:after="200" w:before="0" w:line="408" w:lineRule="auto"/>
-        <w:ind w:firstLine="454"/>
-      </w:pPr>
-      <w:r>
-        <w:rPr>
-          <w:rFonts w:ascii="Microsoft JhengHei" w:hAnsi="Microsoft JhengHei" w:eastAsia="Microsoft JhengHei" w:cs="Microsoft JhengHei"/>
-          <w:b w:val="0"/>
-          <w:color w:val="334155"/>
-          <w:sz w:val="24"/>
-        </w:rPr>
-        <w:t>第二個——</w:t>
-      </w:r>
-      <w:r>
-        <w:rPr>
-          <w:rFonts w:ascii="Microsoft JhengHei" w:hAnsi="Microsoft JhengHei" w:eastAsia="Microsoft JhengHei" w:cs="Microsoft JhengHei"/>
-          <w:b/>
-          <w:color w:val="0F172A"/>
-          <w:sz w:val="24"/>
-        </w:rPr>
-        <w:t>IC 穩定性</w:t>
-      </w:r>
-      <w:r>
-        <w:rPr>
-          <w:rFonts w:ascii="Microsoft JhengHei" w:hAnsi="Microsoft JhengHei" w:eastAsia="Microsoft JhengHei" w:cs="Microsoft JhengHei"/>
-          <w:b w:val="0"/>
-          <w:color w:val="334155"/>
-          <w:sz w:val="24"/>
-        </w:rPr>
-        <w:t>：ICIR 0.7431，跨 fold 方向一致。ICIR 大於 0.5 就算強訊號，0.74 屬於業界研究型標竿。</w:t>
-      </w:r>
-    </w:p>
-    <w:p>
-      <w:pPr>
-        <w:spacing w:after="200" w:before="0" w:line="408" w:lineRule="auto"/>
-        <w:ind w:firstLine="454"/>
-      </w:pPr>
-      <w:r>
-        <w:rPr>
-          <w:rFonts w:ascii="Microsoft JhengHei" w:hAnsi="Microsoft JhengHei" w:eastAsia="Microsoft JhengHei" w:cs="Microsoft JhengHei"/>
-          <w:b w:val="0"/>
-          <w:color w:val="334155"/>
-          <w:sz w:val="24"/>
-        </w:rPr>
-        <w:t>第三個——</w:t>
-      </w:r>
-      <w:r>
-        <w:rPr>
-          <w:rFonts w:ascii="Microsoft JhengHei" w:hAnsi="Microsoft JhengHei" w:eastAsia="Microsoft JhengHei" w:cs="Microsoft JhengHei"/>
-          <w:b/>
-          <w:color w:val="0F172A"/>
-          <w:sz w:val="24"/>
-        </w:rPr>
-        <w:t>統計穩健</w:t>
-      </w:r>
-      <w:r>
-        <w:rPr>
-          <w:rFonts w:ascii="Microsoft JhengHei" w:hAnsi="Microsoft JhengHei" w:eastAsia="Microsoft JhengHei" w:cs="Microsoft JhengHei"/>
-          <w:b w:val="0"/>
-          <w:color w:val="334155"/>
-          <w:sz w:val="24"/>
-        </w:rPr>
-        <w:t>：DSR 12.12。DSR 把跑 150 次參數搜尋的運氣成分扣掉之後，剩下的還是 12.12，遠超過 3.0 的顯著性門檻。</w:t>
-      </w:r>
-    </w:p>
-    <w:p>
-      <w:pPr>
-        <w:spacing w:after="200" w:before="0" w:line="408" w:lineRule="auto"/>
-        <w:ind w:firstLine="454"/>
-      </w:pPr>
-      <w:r>
-        <w:rPr>
-          <w:rFonts w:ascii="Microsoft JhengHei" w:hAnsi="Microsoft JhengHei" w:eastAsia="Microsoft JhengHei" w:cs="Microsoft JhengHei"/>
-          <w:b w:val="0"/>
-          <w:color w:val="334155"/>
-          <w:sz w:val="24"/>
-        </w:rPr>
-        <w:t>第四個——</w:t>
-      </w:r>
-      <w:r>
-        <w:rPr>
-          <w:rFonts w:ascii="Microsoft JhengHei" w:hAnsi="Microsoft JhengHei" w:eastAsia="Microsoft JhengHei" w:cs="Microsoft JhengHei"/>
-          <w:b/>
-          <w:color w:val="0F172A"/>
-          <w:sz w:val="24"/>
-        </w:rPr>
-        <w:t>選股效益</w:t>
-      </w:r>
-      <w:r>
-        <w:rPr>
-          <w:rFonts w:ascii="Microsoft JhengHei" w:hAnsi="Microsoft JhengHei" w:eastAsia="Microsoft JhengHei" w:cs="Microsoft JhengHei"/>
-          <w:b w:val="0"/>
-          <w:color w:val="334155"/>
-          <w:sz w:val="24"/>
-        </w:rPr>
-        <w:t>：Top 1% 命中率 36.81%，比基準（市場整體上漲機率）26.28% 高出 10.53 個百分點、相對提升 40%。</w:t>
-      </w:r>
-    </w:p>
-    <w:p>
-      <w:pPr>
-        <w:spacing w:after="200" w:before="0" w:line="408" w:lineRule="auto"/>
-        <w:ind w:firstLine="454"/>
-      </w:pPr>
-      <w:r>
-        <w:rPr>
-          <w:rFonts w:ascii="Microsoft JhengHei" w:hAnsi="Microsoft JhengHei" w:eastAsia="Microsoft JhengHei" w:cs="Microsoft JhengHei"/>
-          <w:b w:val="0"/>
-          <w:color w:val="334155"/>
-          <w:sz w:val="24"/>
-        </w:rPr>
-        <w:t>下方的 4 折 OOS AUC 全部落在 0.633 到 0.656 之間——</w:t>
-      </w:r>
-      <w:r>
-        <w:rPr>
-          <w:rFonts w:ascii="Microsoft JhengHei" w:hAnsi="Microsoft JhengHei" w:eastAsia="Microsoft JhengHei" w:cs="Microsoft JhengHei"/>
-          <w:b/>
-          <w:color w:val="0F172A"/>
-          <w:sz w:val="24"/>
-        </w:rPr>
-        <w:t>全是同一結論在四個獨立樣本中重複出現</w:t>
-      </w:r>
-      <w:r>
-        <w:rPr>
-          <w:rFonts w:ascii="Microsoft JhengHei" w:hAnsi="Microsoft JhengHei" w:eastAsia="Microsoft JhengHei" w:cs="Microsoft JhengHei"/>
-          <w:b w:val="0"/>
-          <w:color w:val="334155"/>
-          <w:sz w:val="24"/>
-        </w:rPr>
-        <w:t>，這就排除了 p-hacking——也就是「試很多種設定、挑一個漂亮的講」這種統計濫用。</w:t>
-      </w:r>
-    </w:p>
-    <w:p>
-      <w:pPr>
-        <w:spacing w:after="200" w:before="0" w:line="408" w:lineRule="auto"/>
-        <w:ind w:firstLine="454"/>
-      </w:pPr>
-      <w:r>
-        <w:rPr>
-          <w:rFonts w:ascii="Microsoft JhengHei" w:hAnsi="Microsoft JhengHei" w:eastAsia="Microsoft JhengHei" w:cs="Microsoft JhengHei"/>
-          <w:b w:val="0"/>
-          <w:color w:val="334155"/>
-          <w:sz w:val="24"/>
-        </w:rPr>
-        <w:t>換句話說：Top 1% 那 4,047 檔機會、命中率比基準高 10.53 個百分點，是</w:t>
+        <w:t>Top 1% 那 4,047 檔機會、命中率比基準高 10.53 pp，是</w:t>
       </w:r>
       <w:r>
         <w:rPr>
@@ -672,7 +348,7 @@
     </w:p>
     <w:p>
       <w:pPr>
-        <w:spacing w:after="200" w:before="360" w:line="288" w:lineRule="auto"/>
+        <w:spacing w:after="160" w:before="280" w:line="288" w:lineRule="auto"/>
       </w:pPr>
       <w:r>
         <w:rPr>
@@ -686,7 +362,7 @@
     </w:p>
     <w:p>
       <w:pPr>
-        <w:spacing w:after="200" w:before="0" w:line="408" w:lineRule="auto"/>
+        <w:spacing w:after="160" w:before="0" w:line="408" w:lineRule="auto"/>
         <w:ind w:firstLine="454"/>
       </w:pPr>
       <w:r>
@@ -696,7 +372,22 @@
           <w:color w:val="334155"/>
           <w:sz w:val="24"/>
         </w:rPr>
-        <w:t>剛才提到 DSR 12.12，這個數字怎麼來、為什麼重要？我們要說的是——</w:t>
+        <w:t>統計修正後仍顯著，模型結果已越過「回測漂亮」的最低門檻。</w:t>
+      </w:r>
+    </w:p>
+    <w:p>
+      <w:pPr>
+        <w:spacing w:after="160" w:before="0" w:line="408" w:lineRule="auto"/>
+        <w:ind w:firstLine="454"/>
+      </w:pPr>
+      <w:r>
+        <w:rPr>
+          <w:rFonts w:ascii="Microsoft JhengHei" w:hAnsi="Microsoft JhengHei" w:eastAsia="Microsoft JhengHei" w:cs="Microsoft JhengHei"/>
+          <w:b w:val="0"/>
+          <w:color w:val="334155"/>
+          <w:sz w:val="24"/>
+        </w:rPr>
+        <w:t>依 Bailey &amp; López de Prado 2014，原始 Sharpe 2.41、扣多重檢定變異膨脹跟 skew/kurt 修正之後，</w:t>
       </w:r>
       <w:r>
         <w:rPr>
@@ -705,7 +396,7 @@
           <w:color w:val="0F172A"/>
           <w:sz w:val="24"/>
         </w:rPr>
-        <w:t>統計修正後仍顯著，模型結果已越過「回測漂亮」的最低門檻</w:t>
+        <w:t>DSR 12.12，遠超 3.0 顯著門檻、p &lt; 0.001</w:t>
       </w:r>
       <w:r>
         <w:rPr>
@@ -719,7 +410,7 @@
     </w:p>
     <w:p>
       <w:pPr>
-        <w:spacing w:after="200" w:before="0" w:line="408" w:lineRule="auto"/>
+        <w:spacing w:after="160" w:before="0" w:line="408" w:lineRule="auto"/>
         <w:ind w:firstLine="454"/>
       </w:pPr>
       <w:r>
@@ -729,102 +420,12 @@
           <w:color w:val="334155"/>
           <w:sz w:val="24"/>
         </w:rPr>
-        <w:t xml:space="preserve">依 Bailey 與 López de Prado 2014 年提出的方法：原始 Sharpe Ratio 是 2.41，扣掉多重檢定變異膨脹、skew 跟 kurt 的非常態修正、加上 sample 大小校正之後，得到 </w:t>
-      </w:r>
-      <w:r>
-        <w:rPr>
-          <w:rFonts w:ascii="Microsoft JhengHei" w:hAnsi="Microsoft JhengHei" w:eastAsia="Microsoft JhengHei" w:cs="Microsoft JhengHei"/>
-          <w:b/>
-          <w:color w:val="0F172A"/>
-          <w:sz w:val="24"/>
-        </w:rPr>
-        <w:t>DSR 12.12，遠超過統計臨界值 3.0、p 值降至小於 0.001</w:t>
-      </w:r>
-      <w:r>
-        <w:rPr>
-          <w:rFonts w:ascii="Microsoft JhengHei" w:hAnsi="Microsoft JhengHei" w:eastAsia="Microsoft JhengHei" w:cs="Microsoft JhengHei"/>
-          <w:b w:val="0"/>
-          <w:color w:val="334155"/>
-          <w:sz w:val="24"/>
-        </w:rPr>
-        <w:t>。</w:t>
+        <w:t>9 道治理關卡全數 PASS。Text PSI 因詞向量演化觸發 WARN、對策是每月重訓；線上預測流水關卡早期失敗、後續重驗 6/6 全通。</w:t>
       </w:r>
     </w:p>
     <w:p>
       <w:pPr>
-        <w:spacing w:after="200" w:before="0" w:line="408" w:lineRule="auto"/>
-        <w:ind w:firstLine="454"/>
-      </w:pPr>
-      <w:r>
-        <w:rPr>
-          <w:rFonts w:ascii="Microsoft JhengHei" w:hAnsi="Microsoft JhengHei" w:eastAsia="Microsoft JhengHei" w:cs="Microsoft JhengHei"/>
-          <w:b w:val="0"/>
-          <w:color w:val="334155"/>
-          <w:sz w:val="24"/>
-        </w:rPr>
-        <w:t xml:space="preserve">但 DSR 只是其中一道關卡。我們設了 9 道治理關卡：Deflated Sharpe、最差折 AUC、時序隔離、洩漏掃描、PSI 漂移、KS 檢定、可回溯 SQL、可重現性、線上預測流水——目前 </w:t>
-      </w:r>
-      <w:r>
-        <w:rPr>
-          <w:rFonts w:ascii="Microsoft JhengHei" w:hAnsi="Microsoft JhengHei" w:eastAsia="Microsoft JhengHei" w:cs="Microsoft JhengHei"/>
-          <w:b/>
-          <w:color w:val="0F172A"/>
-          <w:sz w:val="24"/>
-        </w:rPr>
-        <w:t>9 道全數 PASS</w:t>
-      </w:r>
-      <w:r>
-        <w:rPr>
-          <w:rFonts w:ascii="Microsoft JhengHei" w:hAnsi="Microsoft JhengHei" w:eastAsia="Microsoft JhengHei" w:cs="Microsoft JhengHei"/>
-          <w:b w:val="0"/>
-          <w:color w:val="334155"/>
-          <w:sz w:val="24"/>
-        </w:rPr>
-        <w:t>。</w:t>
-      </w:r>
-    </w:p>
-    <w:p>
-      <w:pPr>
-        <w:spacing w:after="200" w:before="0" w:line="408" w:lineRule="auto"/>
-        <w:ind w:firstLine="454"/>
-      </w:pPr>
-      <w:r>
-        <w:rPr>
-          <w:rFonts w:ascii="Microsoft JhengHei" w:hAnsi="Microsoft JhengHei" w:eastAsia="Microsoft JhengHei" w:cs="Microsoft JhengHei"/>
-          <w:b w:val="0"/>
-          <w:color w:val="334155"/>
-          <w:sz w:val="24"/>
-        </w:rPr>
-        <w:t>其中 PSI 是業界測「特徵分布有沒有變」的指標。Text PSI 因為語言演化——像 deepseek、矽光子這種新詞——觸發 WARN，對策是每月重新訓練詞向量。線上預測流水關卡早期因欄位漂移失敗、後來重驗 6 / 6 全部通過。</w:t>
-      </w:r>
-    </w:p>
-    <w:p>
-      <w:pPr>
-        <w:spacing w:after="200" w:before="0" w:line="408" w:lineRule="auto"/>
-        <w:ind w:firstLine="454"/>
-      </w:pPr>
-      <w:r>
-        <w:rPr>
-          <w:rFonts w:ascii="Microsoft JhengHei" w:hAnsi="Microsoft JhengHei" w:eastAsia="Microsoft JhengHei" w:cs="Microsoft JhengHei"/>
-          <w:b/>
-          <w:color w:val="0F172A"/>
-          <w:sz w:val="24"/>
-        </w:rPr>
-        <w:t>一句話</w:t>
-      </w:r>
-      <w:r>
-        <w:rPr>
-          <w:rFonts w:ascii="Microsoft JhengHei" w:hAnsi="Microsoft JhengHei" w:eastAsia="Microsoft JhengHei" w:cs="Microsoft JhengHei"/>
-          <w:b w:val="0"/>
-          <w:color w:val="334155"/>
-          <w:sz w:val="24"/>
-        </w:rPr>
-        <w:t>：AUC 0.6455 並非偶然——DSR 通過多重檢定、9 道治理關卡全數通過、Text PSI 觸發 WARN 對應每月詞向量重新訓練。下一步要回答的是：到底哪些因子在驅動這個 AUC？</w:t>
-      </w:r>
-    </w:p>
-    <w:p>
-      <w:pPr>
-        <w:spacing w:after="200" w:before="360" w:line="288" w:lineRule="auto"/>
+        <w:spacing w:after="160" w:before="280" w:line="288" w:lineRule="auto"/>
       </w:pPr>
       <w:r>
         <w:rPr>
@@ -838,7 +439,7 @@
     </w:p>
     <w:p>
       <w:pPr>
-        <w:spacing w:after="200" w:before="0" w:line="408" w:lineRule="auto"/>
+        <w:spacing w:after="160" w:before="0" w:line="408" w:lineRule="auto"/>
         <w:ind w:firstLine="454"/>
       </w:pPr>
       <w:r>
@@ -848,30 +449,12 @@
           <w:color w:val="334155"/>
           <w:sz w:val="24"/>
         </w:rPr>
-        <w:t>哪一支柱在發力？我們做了 LOPO——Leave-One-Pillar-Out 分析，白話講就是「一次拿掉一個支柱、看 AUC 掉多少」。結論其實很簡單——</w:t>
-      </w:r>
-      <w:r>
-        <w:rPr>
-          <w:rFonts w:ascii="Microsoft JhengHei" w:hAnsi="Microsoft JhengHei" w:eastAsia="Microsoft JhengHei" w:cs="Microsoft JhengHei"/>
-          <w:b/>
-          <w:color w:val="0F172A"/>
-          <w:sz w:val="24"/>
-        </w:rPr>
-        <w:t>真正驅動模型的不是特徵數量，而是 Risk × Trend × Text 的訊號協同</w:t>
-      </w:r>
-      <w:r>
-        <w:rPr>
-          <w:rFonts w:ascii="Microsoft JhengHei" w:hAnsi="Microsoft JhengHei" w:eastAsia="Microsoft JhengHei" w:cs="Microsoft JhengHei"/>
-          <w:b w:val="0"/>
-          <w:color w:val="334155"/>
-          <w:sz w:val="24"/>
-        </w:rPr>
-        <w:t>。</w:t>
+        <w:t>真正驅動模型的不是特徵數量、而是 Risk × Trend × Text 的訊號協同。</w:t>
       </w:r>
     </w:p>
     <w:p>
       <w:pPr>
-        <w:spacing w:after="200" w:before="0" w:line="408" w:lineRule="auto"/>
+        <w:spacing w:after="160" w:before="0" w:line="408" w:lineRule="auto"/>
         <w:ind w:firstLine="454"/>
       </w:pPr>
       <w:r>
@@ -881,7 +464,7 @@
           <w:color w:val="334155"/>
           <w:sz w:val="24"/>
         </w:rPr>
-        <w:t>結果非常明確：</w:t>
+        <w:t>LOPO 結果——拿掉一支柱看 AUC 掉多少：</w:t>
       </w:r>
       <w:r>
         <w:rPr>
@@ -890,7 +473,7 @@
           <w:color w:val="0F172A"/>
           <w:sz w:val="24"/>
         </w:rPr>
-        <w:t>Risk 是地基</w:t>
+        <w:t>Risk 是地基、拿掉掉 138.6 bps（約 1.4 pp）</w:t>
       </w:r>
       <w:r>
         <w:rPr>
@@ -899,12 +482,12 @@
           <w:color w:val="334155"/>
           <w:sz w:val="24"/>
         </w:rPr>
-        <w:t>——拿掉 Risk 之後 AUC 掉 138.6 bps，也就是大約 1.4 個百分點，幅度很大。Trend 拿掉掉 64.9 bps、Valuation 9.5、Text 8.5——這四支柱是正貢獻。</w:t>
+        <w:t>；Trend 64.9、Val 9.5、Text 8.5 都是正貢獻。</w:t>
       </w:r>
     </w:p>
     <w:p>
       <w:pPr>
-        <w:spacing w:after="200" w:before="0" w:line="408" w:lineRule="auto"/>
+        <w:spacing w:after="160" w:before="0" w:line="408" w:lineRule="auto"/>
         <w:ind w:firstLine="454"/>
       </w:pPr>
       <w:r>
@@ -914,7 +497,7 @@
           <w:color w:val="334155"/>
           <w:sz w:val="24"/>
         </w:rPr>
-        <w:t>但有趣的是，Chip 籌碼面加上 Event 跟 Industry 這三支柱</w:t>
+        <w:t>但 Chip、Event、Industry 三支柱</w:t>
       </w:r>
       <w:r>
         <w:rPr>
@@ -932,36 +515,12 @@
           <w:color w:val="334155"/>
           <w:sz w:val="24"/>
         </w:rPr>
-        <w:t>——拿掉它們以後 AUC 不降反升、合計負 49 bps。這代表這三支柱目前引入的雜訊多於訊息、是下一輪精簡的對象。</w:t>
+        <w:t>、合計負 49 bps——這三支引入的雜訊多於訊息、是下一輪精簡的對象。</w:t>
       </w:r>
     </w:p>
     <w:p>
       <w:pPr>
-        <w:spacing w:after="200" w:before="0" w:line="408" w:lineRule="auto"/>
-        <w:ind w:firstLine="454"/>
-      </w:pPr>
-      <w:r>
-        <w:rPr>
-          <w:rFonts w:ascii="Microsoft JhengHei" w:hAnsi="Microsoft JhengHei" w:eastAsia="Microsoft JhengHei" w:cs="Microsoft JhengHei"/>
-          <w:b/>
-          <w:color w:val="0F172A"/>
-          <w:sz w:val="24"/>
-        </w:rPr>
-        <w:t>一句話</w:t>
-      </w:r>
-      <w:r>
-        <w:rPr>
-          <w:rFonts w:ascii="Microsoft JhengHei" w:hAnsi="Microsoft JhengHei" w:eastAsia="Microsoft JhengHei" w:cs="Microsoft JhengHei"/>
-          <w:b w:val="0"/>
-          <w:color w:val="334155"/>
-          <w:sz w:val="24"/>
-        </w:rPr>
-        <w:t>：Risk × Trend × Text 是三元協同核心；低品質支柱應進入下一輪精簡。</w:t>
-      </w:r>
-    </w:p>
-    <w:p>
-      <w:pPr>
-        <w:spacing w:after="200" w:before="360" w:line="288" w:lineRule="auto"/>
+        <w:spacing w:after="160" w:before="280" w:line="288" w:lineRule="auto"/>
       </w:pPr>
       <w:r>
         <w:rPr>
@@ -975,7 +534,7 @@
     </w:p>
     <w:p>
       <w:pPr>
-        <w:spacing w:after="200" w:before="0" w:line="408" w:lineRule="auto"/>
+        <w:spacing w:after="160" w:before="0" w:line="408" w:lineRule="auto"/>
         <w:ind w:firstLine="454"/>
       </w:pPr>
       <w:r>
@@ -985,7 +544,7 @@
           <w:color w:val="334155"/>
           <w:sz w:val="24"/>
         </w:rPr>
-        <w:t>文本支柱裡有一個我們特別想分享的發現——</w:t>
+        <w:t>文本支柱有個有趣發現——</w:t>
       </w:r>
       <w:r>
         <w:rPr>
@@ -1003,30 +562,12 @@
           <w:color w:val="334155"/>
           <w:sz w:val="24"/>
         </w:rPr>
-        <w:t>。簡單講就是——</w:t>
-      </w:r>
-      <w:r>
-        <w:rPr>
-          <w:rFonts w:ascii="Microsoft JhengHei" w:hAnsi="Microsoft JhengHei" w:eastAsia="Microsoft JhengHei" w:cs="Microsoft JhengHei"/>
-          <w:b/>
-          <w:color w:val="0F172A"/>
-          <w:sz w:val="24"/>
-        </w:rPr>
-        <w:t>極端情緒提供反向交易訊號，成為主模型之外的 alpha filter</w:t>
-      </w:r>
-      <w:r>
-        <w:rPr>
-          <w:rFonts w:ascii="Microsoft JhengHei" w:hAnsi="Microsoft JhengHei" w:eastAsia="Microsoft JhengHei" w:cs="Microsoft JhengHei"/>
-          <w:b w:val="0"/>
-          <w:color w:val="334155"/>
-          <w:sz w:val="24"/>
-        </w:rPr>
-        <w:t>。簡單講，就是文本情緒可以當作主模型機率分數的「再過濾器」。</w:t>
+        <w:t>。</w:t>
       </w:r>
     </w:p>
     <w:p>
       <w:pPr>
-        <w:spacing w:after="200" w:before="0" w:line="408" w:lineRule="auto"/>
+        <w:spacing w:after="160" w:before="0" w:line="408" w:lineRule="auto"/>
         <w:ind w:firstLine="454"/>
       </w:pPr>
       <w:r>
@@ -1036,7 +577,7 @@
           <w:color w:val="334155"/>
           <w:sz w:val="24"/>
         </w:rPr>
-        <w:t>我們把情緒分數分成五桶：Q1 最悲觀、Q5 最樂觀。原本直覺以為樂觀時隔日 edge 較高，但結果</w:t>
+        <w:t>把情緒分五桶：</w:t>
       </w:r>
       <w:r>
         <w:rPr>
@@ -1045,7 +586,40 @@
           <w:color w:val="0F172A"/>
           <w:sz w:val="24"/>
         </w:rPr>
-        <w:t>完全相反</w:t>
+        <w:t>Q1 最悲觀那一桶、隔日 +3.2 pp</w:t>
+      </w:r>
+      <w:r>
+        <w:rPr>
+          <w:rFonts w:ascii="Microsoft JhengHei" w:hAnsi="Microsoft JhengHei" w:eastAsia="Microsoft JhengHei" w:cs="Microsoft JhengHei"/>
+          <w:b w:val="0"/>
+          <w:color w:val="334155"/>
+          <w:sz w:val="24"/>
+        </w:rPr>
+        <w:t>，是五桶最強的；Q3 中性 negative；Q5 最樂觀只剩 +0.6 pp。</w:t>
+      </w:r>
+    </w:p>
+    <w:p>
+      <w:pPr>
+        <w:spacing w:after="160" w:before="0" w:line="408" w:lineRule="auto"/>
+        <w:ind w:firstLine="454"/>
+      </w:pPr>
+      <w:r>
+        <w:rPr>
+          <w:rFonts w:ascii="Microsoft JhengHei" w:hAnsi="Microsoft JhengHei" w:eastAsia="Microsoft JhengHei" w:cs="Microsoft JhengHei"/>
+          <w:b w:val="0"/>
+          <w:color w:val="334155"/>
+          <w:sz w:val="24"/>
+        </w:rPr>
+        <w:t>對應行為金融兩個經典假說：Q1 反彈印證 Kahneman 過度反應、Q5 弱勢印證 Tetlock 過度樂觀。Q1 + Q5 共佔 sentiment LOPO 的 94%——</w:t>
+      </w:r>
+      <w:r>
+        <w:rPr>
+          <w:rFonts w:ascii="Microsoft JhengHei" w:hAnsi="Microsoft JhengHei" w:eastAsia="Microsoft JhengHei" w:cs="Microsoft JhengHei"/>
+          <w:b/>
+          <w:color w:val="0F172A"/>
+          <w:sz w:val="24"/>
+        </w:rPr>
+        <w:t>極端情緒可作為主模型之上的 alpha filter</w:t>
       </w:r>
       <w:r>
         <w:rPr>
@@ -1059,97 +633,7 @@
     </w:p>
     <w:p>
       <w:pPr>
-        <w:spacing w:after="200" w:before="0" w:line="408" w:lineRule="auto"/>
-        <w:ind w:firstLine="454"/>
-      </w:pPr>
-      <w:r>
-        <w:rPr>
-          <w:rFonts w:ascii="Microsoft JhengHei" w:hAnsi="Microsoft JhengHei" w:eastAsia="Microsoft JhengHei" w:cs="Microsoft JhengHei"/>
-          <w:b/>
-          <w:color w:val="0F172A"/>
-          <w:sz w:val="24"/>
-        </w:rPr>
-        <w:t>Q1 最悲觀</w:t>
-      </w:r>
-      <w:r>
-        <w:rPr>
-          <w:rFonts w:ascii="Microsoft JhengHei" w:hAnsi="Microsoft JhengHei" w:eastAsia="Microsoft JhengHei" w:cs="Microsoft JhengHei"/>
-          <w:b w:val="0"/>
-          <w:color w:val="334155"/>
-          <w:sz w:val="24"/>
-        </w:rPr>
-        <w:t>那一桶、隔日命中率比基準高出 3.2 個百分點，是五桶裡最強的；中性的 Q3 反而 negative；Q5 最樂觀的、edge 只剩 0.6 個百分點。</w:t>
-      </w:r>
-    </w:p>
-    <w:p>
-      <w:pPr>
-        <w:spacing w:after="200" w:before="0" w:line="408" w:lineRule="auto"/>
-        <w:ind w:firstLine="454"/>
-      </w:pPr>
-      <w:r>
-        <w:rPr>
-          <w:rFonts w:ascii="Microsoft JhengHei" w:hAnsi="Microsoft JhengHei" w:eastAsia="Microsoft JhengHei" w:cs="Microsoft JhengHei"/>
-          <w:b w:val="0"/>
-          <w:color w:val="334155"/>
-          <w:sz w:val="24"/>
-        </w:rPr>
-        <w:t>這個結論在 1 天、5 天、20 天三個時序窗口都同向、半衰期超過一個月。對應到行為金融的兩個經典假說：</w:t>
-      </w:r>
-      <w:r>
-        <w:rPr>
-          <w:rFonts w:ascii="Microsoft JhengHei" w:hAnsi="Microsoft JhengHei" w:eastAsia="Microsoft JhengHei" w:cs="Microsoft JhengHei"/>
-          <w:b/>
-          <w:color w:val="0F172A"/>
-          <w:sz w:val="24"/>
-        </w:rPr>
-        <w:t>Q1 反彈</w:t>
-      </w:r>
-      <w:r>
-        <w:rPr>
-          <w:rFonts w:ascii="Microsoft JhengHei" w:hAnsi="Microsoft JhengHei" w:eastAsia="Microsoft JhengHei" w:cs="Microsoft JhengHei"/>
-          <w:b w:val="0"/>
-          <w:color w:val="334155"/>
-          <w:sz w:val="24"/>
-        </w:rPr>
-        <w:t>對齊 Kahneman 1979 年的過度反應假說——極度悲觀時市場過度修正；</w:t>
-      </w:r>
-      <w:r>
-        <w:rPr>
-          <w:rFonts w:ascii="Microsoft JhengHei" w:hAnsi="Microsoft JhengHei" w:eastAsia="Microsoft JhengHei" w:cs="Microsoft JhengHei"/>
-          <w:b/>
-          <w:color w:val="0F172A"/>
-          <w:sz w:val="24"/>
-        </w:rPr>
-        <w:t>Q5 弱勢</w:t>
-      </w:r>
-      <w:r>
-        <w:rPr>
-          <w:rFonts w:ascii="Microsoft JhengHei" w:hAnsi="Microsoft JhengHei" w:eastAsia="Microsoft JhengHei" w:cs="Microsoft JhengHei"/>
-          <w:b w:val="0"/>
-          <w:color w:val="334155"/>
-          <w:sz w:val="24"/>
-        </w:rPr>
-        <w:t>對齊 Tetlock 2007 年的過度樂觀假說——利多已被反映、故事飽和。</w:t>
-      </w:r>
-    </w:p>
-    <w:p>
-      <w:pPr>
-        <w:spacing w:after="200" w:before="0" w:line="408" w:lineRule="auto"/>
-        <w:ind w:firstLine="454"/>
-      </w:pPr>
-      <w:r>
-        <w:rPr>
-          <w:rFonts w:ascii="Microsoft JhengHei" w:hAnsi="Microsoft JhengHei" w:eastAsia="Microsoft JhengHei" w:cs="Microsoft JhengHei"/>
-          <w:b w:val="0"/>
-          <w:color w:val="334155"/>
-          <w:sz w:val="24"/>
-        </w:rPr>
-        <w:t>兩個資料源——新聞與論壇——相關係數只有 0.20、各自獨立，可以互補。Q1 加 Q5 共佔 sentiment LOPO +8.5 bps 中的 94%——文本情緒的 alpha 集中在兩端、可作為主模型之上的 alpha filter。</w:t>
-      </w:r>
-    </w:p>
-    <w:p>
-      <w:pPr>
-        <w:spacing w:after="200" w:before="360" w:line="288" w:lineRule="auto"/>
+        <w:spacing w:after="160" w:before="280" w:line="288" w:lineRule="auto"/>
       </w:pPr>
       <w:r>
         <w:rPr>
@@ -1163,7 +647,7 @@
     </w:p>
     <w:p>
       <w:pPr>
-        <w:spacing w:after="200" w:before="0" w:line="408" w:lineRule="auto"/>
+        <w:spacing w:after="160" w:before="0" w:line="408" w:lineRule="auto"/>
         <w:ind w:firstLine="454"/>
       </w:pPr>
       <w:r>
@@ -1173,8 +657,14 @@
           <w:color w:val="334155"/>
           <w:sz w:val="24"/>
         </w:rPr>
-        <w:t>從機率分數到可下單清單。重點是——</w:t>
+        <w:t>模型分數已能變成每日可下單的選股清單。</w:t>
       </w:r>
+    </w:p>
+    <w:p>
+      <w:pPr>
+        <w:spacing w:after="160" w:before="0" w:line="408" w:lineRule="auto"/>
+        <w:ind w:firstLine="454"/>
+      </w:pPr>
       <w:r>
         <w:rPr>
           <w:rFonts w:ascii="Microsoft JhengHei" w:hAnsi="Microsoft JhengHei" w:eastAsia="Microsoft JhengHei" w:cs="Microsoft JhengHei"/>
@@ -1182,40 +672,7 @@
           <w:color w:val="0F172A"/>
           <w:sz w:val="24"/>
         </w:rPr>
-        <w:t>模型分數已能被產品化為每日可執行的選股清單，threshold 決定是主動下注或研究 coverage</w:t>
-      </w:r>
-      <w:r>
-        <w:rPr>
-          <w:rFonts w:ascii="Microsoft JhengHei" w:hAnsi="Microsoft JhengHei" w:eastAsia="Microsoft JhengHei" w:cs="Microsoft JhengHei"/>
-          <w:b w:val="0"/>
-          <w:color w:val="334155"/>
-          <w:sz w:val="24"/>
-        </w:rPr>
-        <w:t>。threshold 就是「機率多高才出手」的門檻。</w:t>
-      </w:r>
-    </w:p>
-    <w:p>
-      <w:pPr>
-        <w:spacing w:after="200" w:before="0" w:line="408" w:lineRule="auto"/>
-        <w:ind w:firstLine="454"/>
-      </w:pPr>
-      <w:r>
-        <w:rPr>
-          <w:rFonts w:ascii="Microsoft JhengHei" w:hAnsi="Microsoft JhengHei" w:eastAsia="Microsoft JhengHei" w:cs="Microsoft JhengHei"/>
-          <w:b w:val="0"/>
-          <w:color w:val="334155"/>
-          <w:sz w:val="24"/>
-        </w:rPr>
-        <w:t>我們做了 40 個門檻的掃描，結果是：門檻越嚴、edge 越陡。Top 10% 命中 28.88% / +2.6 pp；Top 5% 31.44% / +5.16 pp；Top 1% 36.81% / +10.53 pp；</w:t>
-      </w:r>
-      <w:r>
-        <w:rPr>
-          <w:rFonts w:ascii="Microsoft JhengHei" w:hAnsi="Microsoft JhengHei" w:eastAsia="Microsoft JhengHei" w:cs="Microsoft JhengHei"/>
-          <w:b/>
-          <w:color w:val="0F172A"/>
-          <w:sz w:val="24"/>
-        </w:rPr>
-        <w:t>最嚴的閾值 0.50 那一軌，2,836 檔，命中 37.98% / 邊際 +11.70 pp</w:t>
+        <w:t>閾值 0.50 那一軌——2,836 檔——命中 37.98%、邊際 +11.70 pp</w:t>
       </w:r>
       <w:r>
         <w:rPr>
@@ -1229,7 +686,7 @@
     </w:p>
     <w:p>
       <w:pPr>
-        <w:spacing w:after="200" w:before="0" w:line="408" w:lineRule="auto"/>
+        <w:spacing w:after="160" w:before="0" w:line="408" w:lineRule="auto"/>
         <w:ind w:firstLine="454"/>
       </w:pPr>
       <w:r>
@@ -1239,30 +696,12 @@
           <w:color w:val="334155"/>
           <w:sz w:val="24"/>
         </w:rPr>
-        <w:t>但閾值 0.50 一天能挑到的標的有限、不是所有資金屬性都適用。所以我們設計了</w:t>
-      </w:r>
-      <w:r>
-        <w:rPr>
-          <w:rFonts w:ascii="Microsoft JhengHei" w:hAnsi="Microsoft JhengHei" w:eastAsia="Microsoft JhengHei" w:cs="Microsoft JhengHei"/>
-          <w:b/>
-          <w:color w:val="0F172A"/>
-          <w:sz w:val="24"/>
-        </w:rPr>
-        <w:t>雙軌部位</w:t>
-      </w:r>
-      <w:r>
-        <w:rPr>
-          <w:rFonts w:ascii="Microsoft JhengHei" w:hAnsi="Microsoft JhengHei" w:eastAsia="Microsoft JhengHei" w:cs="Microsoft JhengHei"/>
-          <w:b w:val="0"/>
-          <w:color w:val="334155"/>
-          <w:sz w:val="24"/>
-        </w:rPr>
-        <w:t>：</w:t>
+        <w:t>我們設計雙軌部位：A 軌 threshold 0.50、call rate 0.7%、edge +11.7 pp，給主動基金實盤；B 軌 threshold 0.40、call rate 8.83%、edge +3.14 pp，給研究 watchlist。</w:t>
       </w:r>
     </w:p>
     <w:p>
       <w:pPr>
-        <w:spacing w:after="200" w:before="0" w:line="408" w:lineRule="auto"/>
+        <w:spacing w:after="160" w:before="0" w:line="408" w:lineRule="auto"/>
         <w:ind w:firstLine="454"/>
       </w:pPr>
       <w:r>
@@ -1272,237 +711,7 @@
           <w:color w:val="334155"/>
           <w:sz w:val="24"/>
         </w:rPr>
-        <w:t>A 軌</w:t>
-      </w:r>
-      <w:r>
-        <w:rPr>
-          <w:rFonts w:ascii="Microsoft JhengHei" w:hAnsi="Microsoft JhengHei" w:eastAsia="Microsoft JhengHei" w:cs="Microsoft JhengHei"/>
-          <w:b/>
-          <w:color w:val="0F172A"/>
-          <w:sz w:val="24"/>
-        </w:rPr>
-        <w:t>高信心</w:t>
-      </w:r>
-      <w:r>
-        <w:rPr>
-          <w:rFonts w:ascii="Microsoft JhengHei" w:hAnsi="Microsoft JhengHei" w:eastAsia="Microsoft JhengHei" w:cs="Microsoft JhengHei"/>
-          <w:b w:val="0"/>
-          <w:color w:val="334155"/>
-          <w:sz w:val="24"/>
-        </w:rPr>
-        <w:t>：threshold 0.50、call rate 0.70%——也就是平均每天出手率 0.7%、命中 37.98%、edge +11.7 pp。對應主動基金實盤、自營部位，散戶也可操作、每日 2 至 3 檔。</w:t>
-      </w:r>
-    </w:p>
-    <w:p>
-      <w:pPr>
-        <w:spacing w:after="200" w:before="0" w:line="408" w:lineRule="auto"/>
-        <w:ind w:firstLine="454"/>
-      </w:pPr>
-      <w:r>
-        <w:rPr>
-          <w:rFonts w:ascii="Microsoft JhengHei" w:hAnsi="Microsoft JhengHei" w:eastAsia="Microsoft JhengHei" w:cs="Microsoft JhengHei"/>
-          <w:b w:val="0"/>
-          <w:color w:val="334155"/>
-          <w:sz w:val="24"/>
-        </w:rPr>
-        <w:t>B 軌</w:t>
-      </w:r>
-      <w:r>
-        <w:rPr>
-          <w:rFonts w:ascii="Microsoft JhengHei" w:hAnsi="Microsoft JhengHei" w:eastAsia="Microsoft JhengHei" w:cs="Microsoft JhengHei"/>
-          <w:b/>
-          <w:color w:val="0F172A"/>
-          <w:sz w:val="24"/>
-        </w:rPr>
-        <w:t>廣覆蓋</w:t>
-      </w:r>
-      <w:r>
-        <w:rPr>
-          <w:rFonts w:ascii="Microsoft JhengHei" w:hAnsi="Microsoft JhengHei" w:eastAsia="Microsoft JhengHei" w:cs="Microsoft JhengHei"/>
-          <w:b w:val="0"/>
-          <w:color w:val="334155"/>
-          <w:sz w:val="24"/>
-        </w:rPr>
-        <w:t>：threshold 0.40、call rate 8.83%、命中 29.41%、edge +3.14 pp。對應研究 watchlist——也就是「待觀察清單」，每日 30 至 40 檔。</w:t>
-      </w:r>
-    </w:p>
-    <w:p>
-      <w:pPr>
-        <w:spacing w:after="200" w:before="0" w:line="408" w:lineRule="auto"/>
-        <w:ind w:firstLine="454"/>
-      </w:pPr>
-      <w:r>
-        <w:rPr>
-          <w:rFonts w:ascii="Microsoft JhengHei" w:hAnsi="Microsoft JhengHei" w:eastAsia="Microsoft JhengHei" w:cs="Microsoft JhengHei"/>
-          <w:b w:val="0"/>
-          <w:color w:val="334155"/>
-          <w:sz w:val="24"/>
-        </w:rPr>
-        <w:t>兩軌共用同一機率分數、差異僅在閾值。</w:t>
-      </w:r>
-      <w:r>
-        <w:rPr>
-          <w:rFonts w:ascii="Microsoft JhengHei" w:hAnsi="Microsoft JhengHei" w:eastAsia="Microsoft JhengHei" w:cs="Microsoft JhengHei"/>
-          <w:b/>
-          <w:color w:val="0F172A"/>
-          <w:sz w:val="24"/>
-        </w:rPr>
-        <w:t>扣 20 bps 交易成本後，A 軌 net edge 約 +11.5 pp、B 軌約 +2.9 pp</w:t>
-      </w:r>
-      <w:r>
-        <w:rPr>
-          <w:rFonts w:ascii="Microsoft JhengHei" w:hAnsi="Microsoft JhengHei" w:eastAsia="Microsoft JhengHei" w:cs="Microsoft JhengHei"/>
-          <w:b w:val="0"/>
-          <w:color w:val="334155"/>
-          <w:sz w:val="24"/>
-        </w:rPr>
-        <w:t>——本研究為學術成果、不構成投資建議。</w:t>
-      </w:r>
-    </w:p>
-    <w:p>
-      <w:pPr>
-        <w:spacing w:after="200" w:before="360" w:line="288" w:lineRule="auto"/>
-      </w:pPr>
-      <w:r>
-        <w:rPr>
-          <w:rFonts w:ascii="Microsoft JhengHei" w:hAnsi="Microsoft JhengHei" w:eastAsia="Microsoft JhengHei" w:cs="Microsoft JhengHei"/>
-          <w:b/>
-          <w:color w:val="1E3A8A"/>
-          <w:sz w:val="28"/>
-        </w:rPr>
-        <w:t>P.09 · STRATEGY BACKTEST</w:t>
-      </w:r>
-    </w:p>
-    <w:p>
-      <w:pPr>
-        <w:spacing w:after="200" w:before="0" w:line="408" w:lineRule="auto"/>
-        <w:ind w:firstLine="454"/>
-      </w:pPr>
-      <w:r>
-        <w:rPr>
-          <w:rFonts w:ascii="Microsoft JhengHei" w:hAnsi="Microsoft JhengHei" w:eastAsia="Microsoft JhengHei" w:cs="Microsoft JhengHei"/>
-          <w:b w:val="0"/>
-          <w:color w:val="334155"/>
-          <w:sz w:val="24"/>
-        </w:rPr>
-        <w:t>把這些機率分數真的化為實單會怎樣？我們要回答的是——</w:t>
-      </w:r>
-      <w:r>
-        <w:rPr>
-          <w:rFonts w:ascii="Microsoft JhengHei" w:hAnsi="Microsoft JhengHei" w:eastAsia="Microsoft JhengHei" w:cs="Microsoft JhengHei"/>
-          <w:b/>
-          <w:color w:val="0F172A"/>
-          <w:sz w:val="24"/>
-        </w:rPr>
-        <w:t>Top 1% 高信心訊號能把預測優勢轉化為策略績效</w:t>
-      </w:r>
-      <w:r>
-        <w:rPr>
-          <w:rFonts w:ascii="Microsoft JhengHei" w:hAnsi="Microsoft JhengHei" w:eastAsia="Microsoft JhengHei" w:cs="Microsoft JhengHei"/>
-          <w:b w:val="0"/>
-          <w:color w:val="334155"/>
-          <w:sz w:val="24"/>
-        </w:rPr>
-        <w:t>，但需要維持一致的成本口徑。</w:t>
-      </w:r>
-    </w:p>
-    <w:p>
-      <w:pPr>
-        <w:spacing w:after="200" w:before="0" w:line="408" w:lineRule="auto"/>
-        <w:ind w:firstLine="454"/>
-      </w:pPr>
-      <w:r>
-        <w:rPr>
-          <w:rFonts w:ascii="Microsoft JhengHei" w:hAnsi="Microsoft JhengHei" w:eastAsia="Microsoft JhengHei" w:cs="Microsoft JhengHei"/>
-          <w:b w:val="0"/>
-          <w:color w:val="334155"/>
-          <w:sz w:val="24"/>
-        </w:rPr>
-        <w:t>我們用 Top 1% 策略、月初再平衡、含手續費 0.3% 與滑價 0.1%，回測 24 個月。結果是：</w:t>
-      </w:r>
-      <w:r>
-        <w:rPr>
-          <w:rFonts w:ascii="Microsoft JhengHei" w:hAnsi="Microsoft JhengHei" w:eastAsia="Microsoft JhengHei" w:cs="Microsoft JhengHei"/>
-          <w:b/>
-          <w:color w:val="0F172A"/>
-          <w:sz w:val="24"/>
-        </w:rPr>
-        <w:t>100 元起始資金，24 個月後達到 188 元</w:t>
-      </w:r>
-      <w:r>
-        <w:rPr>
-          <w:rFonts w:ascii="Microsoft JhengHei" w:hAnsi="Microsoft JhengHei" w:eastAsia="Microsoft JhengHei" w:cs="Microsoft JhengHei"/>
-          <w:b w:val="0"/>
-          <w:color w:val="334155"/>
-          <w:sz w:val="24"/>
-        </w:rPr>
-        <w:t>——累積 +88%、CAGR——也就是年化複合報酬率 +36.8%。同期 TAIEX 累計 +25% / 年化 +12.4%，</w:t>
-      </w:r>
-      <w:r>
-        <w:rPr>
-          <w:rFonts w:ascii="Microsoft JhengHei" w:hAnsi="Microsoft JhengHei" w:eastAsia="Microsoft JhengHei" w:cs="Microsoft JhengHei"/>
-          <w:b/>
-          <w:color w:val="0F172A"/>
-          <w:sz w:val="24"/>
-        </w:rPr>
-        <w:t>策略相對基準的 alpha 約 24 個百分點</w:t>
-      </w:r>
-      <w:r>
-        <w:rPr>
-          <w:rFonts w:ascii="Microsoft JhengHei" w:hAnsi="Microsoft JhengHei" w:eastAsia="Microsoft JhengHei" w:cs="Microsoft JhengHei"/>
-          <w:b w:val="0"/>
-          <w:color w:val="334155"/>
-          <w:sz w:val="24"/>
-        </w:rPr>
-        <w:t>。</w:t>
-      </w:r>
-    </w:p>
-    <w:p>
-      <w:pPr>
-        <w:spacing w:after="200" w:before="0" w:line="408" w:lineRule="auto"/>
-        <w:ind w:firstLine="454"/>
-      </w:pPr>
-      <w:r>
-        <w:rPr>
-          <w:rFonts w:ascii="Microsoft JhengHei" w:hAnsi="Microsoft JhengHei" w:eastAsia="Microsoft JhengHei" w:cs="Microsoft JhengHei"/>
-          <w:b w:val="0"/>
-          <w:color w:val="334155"/>
-          <w:sz w:val="24"/>
-        </w:rPr>
-        <w:t>風險面同樣關鍵：</w:t>
-      </w:r>
-      <w:r>
-        <w:rPr>
-          <w:rFonts w:ascii="Microsoft JhengHei" w:hAnsi="Microsoft JhengHei" w:eastAsia="Microsoft JhengHei" w:cs="Microsoft JhengHei"/>
-          <w:b/>
-          <w:color w:val="0F172A"/>
-          <w:sz w:val="24"/>
-        </w:rPr>
-        <w:t>最大回撤 -14.2%、TAIEX 同期 -22.4%</w:t>
-      </w:r>
-      <w:r>
-        <w:rPr>
-          <w:rFonts w:ascii="Microsoft JhengHei" w:hAnsi="Microsoft JhengHei" w:eastAsia="Microsoft JhengHei" w:cs="Microsoft JhengHei"/>
-          <w:b w:val="0"/>
-          <w:color w:val="334155"/>
-          <w:sz w:val="24"/>
-        </w:rPr>
-        <w:t>——也就是策略不只是報酬高、回撤也比大盤淺。Sharpe 0.81 對 0.42、Calmar 2.59 對 0.55——這兩個指標衡量的是「每承受一單位波動 / 回撤換到多少報酬」，我們的策略大約是大盤的 2 到 5 倍。</w:t>
-      </w:r>
-    </w:p>
-    <w:p>
-      <w:pPr>
-        <w:spacing w:after="200" w:before="0" w:line="408" w:lineRule="auto"/>
-        <w:ind w:firstLine="454"/>
-      </w:pPr>
-      <w:r>
-        <w:rPr>
-          <w:rFonts w:ascii="Microsoft JhengHei" w:hAnsi="Microsoft JhengHei" w:eastAsia="Microsoft JhengHei" w:cs="Microsoft JhengHei"/>
-          <w:b w:val="0"/>
-          <w:color w:val="334155"/>
-          <w:sz w:val="24"/>
-        </w:rPr>
-        <w:t>特別強調一下：這是學術回測、含合理交易成本，但</w:t>
+        <w:t>扣 20 bps 交易成本後仍有 +11.5 pp / +2.9 pp。本研究為學術成果、</w:t>
       </w:r>
       <w:r>
         <w:rPr>
@@ -1520,12 +729,140 @@
           <w:color w:val="334155"/>
           <w:sz w:val="24"/>
         </w:rPr>
-        <w:t>；A.16 附錄展示了 5 / 15 / 30 bps 三種成本情境壓力測試，即使在 30 bps 極端成本下策略仍維持正報酬。</w:t>
+        <w:t>。</w:t>
       </w:r>
     </w:p>
     <w:p>
       <w:pPr>
-        <w:spacing w:after="200" w:before="360" w:line="288" w:lineRule="auto"/>
+        <w:spacing w:after="160" w:before="280" w:line="288" w:lineRule="auto"/>
+      </w:pPr>
+      <w:r>
+        <w:rPr>
+          <w:rFonts w:ascii="Microsoft JhengHei" w:hAnsi="Microsoft JhengHei" w:eastAsia="Microsoft JhengHei" w:cs="Microsoft JhengHei"/>
+          <w:b/>
+          <w:color w:val="1E3A8A"/>
+          <w:sz w:val="28"/>
+        </w:rPr>
+        <w:t>P.09 · STRATEGY BACKTEST</w:t>
+      </w:r>
+    </w:p>
+    <w:p>
+      <w:pPr>
+        <w:spacing w:after="160" w:before="0" w:line="408" w:lineRule="auto"/>
+        <w:ind w:firstLine="454"/>
+      </w:pPr>
+      <w:r>
+        <w:rPr>
+          <w:rFonts w:ascii="Microsoft JhengHei" w:hAnsi="Microsoft JhengHei" w:eastAsia="Microsoft JhengHei" w:cs="Microsoft JhengHei"/>
+          <w:b w:val="0"/>
+          <w:color w:val="334155"/>
+          <w:sz w:val="24"/>
+        </w:rPr>
+        <w:t>把這些訊號真的當實單跑會怎樣？</w:t>
+      </w:r>
+    </w:p>
+    <w:p>
+      <w:pPr>
+        <w:spacing w:after="160" w:before="0" w:line="408" w:lineRule="auto"/>
+        <w:ind w:firstLine="454"/>
+      </w:pPr>
+      <w:r>
+        <w:rPr>
+          <w:rFonts w:ascii="Microsoft JhengHei" w:hAnsi="Microsoft JhengHei" w:eastAsia="Microsoft JhengHei" w:cs="Microsoft JhengHei"/>
+          <w:b w:val="0"/>
+          <w:color w:val="334155"/>
+          <w:sz w:val="24"/>
+        </w:rPr>
+        <w:t>Top 1% 策略、月再平衡、含手續費 0.3% 與滑價 0.1%、回測 24 個月：</w:t>
+      </w:r>
+      <w:r>
+        <w:rPr>
+          <w:rFonts w:ascii="Microsoft JhengHei" w:hAnsi="Microsoft JhengHei" w:eastAsia="Microsoft JhengHei" w:cs="Microsoft JhengHei"/>
+          <w:b/>
+          <w:color w:val="0F172A"/>
+          <w:sz w:val="24"/>
+        </w:rPr>
+        <w:t>100 元起始、24 個月後到 188 元</w:t>
+      </w:r>
+      <w:r>
+        <w:rPr>
+          <w:rFonts w:ascii="Microsoft JhengHei" w:hAnsi="Microsoft JhengHei" w:eastAsia="Microsoft JhengHei" w:cs="Microsoft JhengHei"/>
+          <w:b w:val="0"/>
+          <w:color w:val="334155"/>
+          <w:sz w:val="24"/>
+        </w:rPr>
+        <w:t>——CAGR +36.8%、同期 TAIEX 只有 +12.4%。</w:t>
+      </w:r>
+    </w:p>
+    <w:p>
+      <w:pPr>
+        <w:spacing w:after="160" w:before="0" w:line="408" w:lineRule="auto"/>
+        <w:ind w:firstLine="454"/>
+      </w:pPr>
+      <w:r>
+        <w:rPr>
+          <w:rFonts w:ascii="Microsoft JhengHei" w:hAnsi="Microsoft JhengHei" w:eastAsia="Microsoft JhengHei" w:cs="Microsoft JhengHei"/>
+          <w:b w:val="0"/>
+          <w:color w:val="334155"/>
+          <w:sz w:val="24"/>
+        </w:rPr>
+        <w:t>風險面：</w:t>
+      </w:r>
+      <w:r>
+        <w:rPr>
+          <w:rFonts w:ascii="Microsoft JhengHei" w:hAnsi="Microsoft JhengHei" w:eastAsia="Microsoft JhengHei" w:cs="Microsoft JhengHei"/>
+          <w:b/>
+          <w:color w:val="0F172A"/>
+          <w:sz w:val="24"/>
+        </w:rPr>
+        <w:t>最大回撤 -14.2%</w:t>
+      </w:r>
+      <w:r>
+        <w:rPr>
+          <w:rFonts w:ascii="Microsoft JhengHei" w:hAnsi="Microsoft JhengHei" w:eastAsia="Microsoft JhengHei" w:cs="Microsoft JhengHei"/>
+          <w:b w:val="0"/>
+          <w:color w:val="334155"/>
+          <w:sz w:val="24"/>
+        </w:rPr>
+        <w:t>，TAIEX 同期 -22.4%、回撤淺很多。Sharpe 0.81 對 0.42、Calmar 2.59 對 0.55——大盤的 2 到 5 倍。</w:t>
+      </w:r>
+    </w:p>
+    <w:p>
+      <w:pPr>
+        <w:spacing w:after="160" w:before="0" w:line="408" w:lineRule="auto"/>
+        <w:ind w:firstLine="454"/>
+      </w:pPr>
+      <w:r>
+        <w:rPr>
+          <w:rFonts w:ascii="Microsoft JhengHei" w:hAnsi="Microsoft JhengHei" w:eastAsia="Microsoft JhengHei" w:cs="Microsoft JhengHei"/>
+          <w:b w:val="0"/>
+          <w:color w:val="334155"/>
+          <w:sz w:val="24"/>
+        </w:rPr>
+        <w:t>學術回測、</w:t>
+      </w:r>
+      <w:r>
+        <w:rPr>
+          <w:rFonts w:ascii="Microsoft JhengHei" w:hAnsi="Microsoft JhengHei" w:eastAsia="Microsoft JhengHei" w:cs="Microsoft JhengHei"/>
+          <w:b/>
+          <w:color w:val="0F172A"/>
+          <w:sz w:val="24"/>
+        </w:rPr>
+        <w:t>不構成投資建議</w:t>
+      </w:r>
+      <w:r>
+        <w:rPr>
+          <w:rFonts w:ascii="Microsoft JhengHei" w:hAnsi="Microsoft JhengHei" w:eastAsia="Microsoft JhengHei" w:cs="Microsoft JhengHei"/>
+          <w:b w:val="0"/>
+          <w:color w:val="334155"/>
+          <w:sz w:val="24"/>
+        </w:rPr>
+        <w:t>；極端 30 bps 成本壓力測試下仍維持正報酬。</w:t>
+      </w:r>
+    </w:p>
+    <w:p>
+      <w:pPr>
+        <w:spacing w:after="160" w:before="280" w:line="288" w:lineRule="auto"/>
       </w:pPr>
       <w:r>
         <w:rPr>
@@ -1539,7 +876,7 @@
     </w:p>
     <w:p>
       <w:pPr>
-        <w:spacing w:after="200" w:before="0" w:line="408" w:lineRule="auto"/>
+        <w:spacing w:after="160" w:before="0" w:line="408" w:lineRule="auto"/>
         <w:ind w:firstLine="454"/>
       </w:pPr>
       <w:r>
@@ -1549,30 +886,12 @@
           <w:color w:val="334155"/>
           <w:sz w:val="24"/>
         </w:rPr>
-        <w:t>最後一頁、是這份研究的邊界與下一步。我們的立場是——</w:t>
-      </w:r>
-      <w:r>
-        <w:rPr>
-          <w:rFonts w:ascii="Microsoft JhengHei" w:hAnsi="Microsoft JhengHei" w:eastAsia="Microsoft JhengHei" w:cs="Microsoft JhengHei"/>
-          <w:b/>
-          <w:color w:val="0F172A"/>
-          <w:sz w:val="24"/>
-        </w:rPr>
-        <w:t>部署不是上線模型，而是建立可監控、可重新訓練、可停損的研究系統</w:t>
-      </w:r>
-      <w:r>
-        <w:rPr>
-          <w:rFonts w:ascii="Microsoft JhengHei" w:hAnsi="Microsoft JhengHei" w:eastAsia="Microsoft JhengHei" w:cs="Microsoft JhengHei"/>
-          <w:b w:val="0"/>
-          <w:color w:val="334155"/>
-          <w:sz w:val="24"/>
-        </w:rPr>
-        <w:t>。</w:t>
+        <w:t>部署不是上線模型、而是建立可監控、可重訓、可停損的研究系統。</w:t>
       </w:r>
     </w:p>
     <w:p>
       <w:pPr>
-        <w:spacing w:after="200" w:before="0" w:line="408" w:lineRule="auto"/>
+        <w:spacing w:after="160" w:before="0" w:line="408" w:lineRule="auto"/>
         <w:ind w:firstLine="454"/>
       </w:pPr>
       <w:r>
@@ -1591,12 +910,12 @@
           <w:color w:val="334155"/>
           <w:sz w:val="24"/>
         </w:rPr>
-        <w:t>：AUC 0.6455 OOS 4 折一致、DSR 12.12 通過多重檢定、Top 1% 命中 36.81%、9 道治理關卡全數通過、91 / 91 特徵 SQL 可回溯。</w:t>
+        <w:t>：AUC、DSR、Top 1%、Gates、Lineage 五項皆已備齊。</w:t>
       </w:r>
     </w:p>
     <w:p>
       <w:pPr>
-        <w:spacing w:after="200" w:before="0" w:line="408" w:lineRule="auto"/>
+        <w:spacing w:after="160" w:before="0" w:line="408" w:lineRule="auto"/>
         <w:ind w:firstLine="454"/>
       </w:pPr>
       <w:r>
@@ -1606,7 +925,7 @@
           <w:color w:val="0F172A"/>
           <w:sz w:val="24"/>
         </w:rPr>
-        <w:t>邊界要說清楚</w:t>
+        <w:t>三大限制</w:t>
       </w:r>
       <w:r>
         <w:rPr>
@@ -1615,66 +934,12 @@
           <w:color w:val="334155"/>
           <w:sz w:val="24"/>
         </w:rPr>
-        <w:t>——三大限制：</w:t>
-      </w:r>
-      <w:r>
-        <w:rPr>
-          <w:rFonts w:ascii="Microsoft JhengHei" w:hAnsi="Microsoft JhengHei" w:eastAsia="Microsoft JhengHei" w:cs="Microsoft JhengHei"/>
-          <w:b/>
-          <w:color w:val="0F172A"/>
-          <w:sz w:val="24"/>
-        </w:rPr>
-        <w:t>SCOPE</w:t>
-      </w:r>
-      <w:r>
-        <w:rPr>
-          <w:rFonts w:ascii="Microsoft JhengHei" w:hAnsi="Microsoft JhengHei" w:eastAsia="Microsoft JhengHei" w:cs="Microsoft JhengHei"/>
-          <w:b w:val="0"/>
-          <w:color w:val="334155"/>
-          <w:sz w:val="24"/>
-        </w:rPr>
-        <w:t xml:space="preserve"> 本系統只適用 D+20 中長線、不適用當沖；</w:t>
-      </w:r>
-      <w:r>
-        <w:rPr>
-          <w:rFonts w:ascii="Microsoft JhengHei" w:hAnsi="Microsoft JhengHei" w:eastAsia="Microsoft JhengHei" w:cs="Microsoft JhengHei"/>
-          <w:b/>
-          <w:color w:val="0F172A"/>
-          <w:sz w:val="24"/>
-        </w:rPr>
-        <w:t>TEXT</w:t>
-      </w:r>
-      <w:r>
-        <w:rPr>
-          <w:rFonts w:ascii="Microsoft JhengHei" w:hAnsi="Microsoft JhengHei" w:eastAsia="Microsoft JhengHei" w:cs="Microsoft JhengHei"/>
-          <w:b w:val="0"/>
-          <w:color w:val="334155"/>
-          <w:sz w:val="24"/>
-        </w:rPr>
-        <w:t xml:space="preserve"> 因語言演化、詞向量需每月重新訓練；</w:t>
-      </w:r>
-      <w:r>
-        <w:rPr>
-          <w:rFonts w:ascii="Microsoft JhengHei" w:hAnsi="Microsoft JhengHei" w:eastAsia="Microsoft JhengHei" w:cs="Microsoft JhengHei"/>
-          <w:b/>
-          <w:color w:val="0F172A"/>
-          <w:sz w:val="24"/>
-        </w:rPr>
-        <w:t>REGIME</w:t>
-      </w:r>
-      <w:r>
-        <w:rPr>
-          <w:rFonts w:ascii="Microsoft JhengHei" w:hAnsi="Microsoft JhengHei" w:eastAsia="Microsoft JhengHei" w:cs="Microsoft JhengHei"/>
-          <w:b w:val="0"/>
-          <w:color w:val="334155"/>
-          <w:sz w:val="24"/>
-        </w:rPr>
-        <w:t xml:space="preserve"> 訓練窗口是 2024-Q4 到 2025-Q1 多頭主導、極端崩跌情境尚未涵蓋。</w:t>
+        <w:t>：SCOPE 只適用 D+20、不適用當沖；TEXT 詞向量需每月重訓；REGIME 訓練窗口是多頭、極端崩跌情境未涵蓋。</w:t>
       </w:r>
     </w:p>
     <w:p>
       <w:pPr>
-        <w:spacing w:after="200" w:before="0" w:line="408" w:lineRule="auto"/>
+        <w:spacing w:after="160" w:before="0" w:line="408" w:lineRule="auto"/>
         <w:ind w:firstLine="454"/>
       </w:pPr>
       <w:r>
@@ -1693,36 +958,12 @@
           <w:color w:val="334155"/>
           <w:sz w:val="24"/>
         </w:rPr>
-        <w:t>分三步：Q2 把 Top 1% 服務化、用 API 試接 1 個客戶做 POC——也就是概念驗證；Q2 到 Q3 把 Risk 支柱獨立做風控 overlay——overlay 就是「主模型上加一層獨立風控」、並追加可解釋性；Q3 到 Q4 完成每月詞向量重新訓練、PSI 自動回報、防 drift——也就是分布漂移大於 0.20 自動觸發警告。</w:t>
+        <w:t>：Q2 Top 1% 服務化、API 試接 1 客戶做 POC；Q2-Q3 Risk 支柱獨立 overlay；Q3-Q4 詞向量月重訓 + PSI 自動回報、防 drift &gt; 0.20。</w:t>
       </w:r>
     </w:p>
     <w:p>
       <w:pPr>
-        <w:spacing w:after="200" w:before="0" w:line="408" w:lineRule="auto"/>
-        <w:ind w:firstLine="454"/>
-      </w:pPr>
-      <w:r>
-        <w:rPr>
-          <w:rFonts w:ascii="Microsoft JhengHei" w:hAnsi="Microsoft JhengHei" w:eastAsia="Microsoft JhengHei" w:cs="Microsoft JhengHei"/>
-          <w:b/>
-          <w:color w:val="0F172A"/>
-          <w:sz w:val="24"/>
-        </w:rPr>
-        <w:t>一句話</w:t>
-      </w:r>
-      <w:r>
-        <w:rPr>
-          <w:rFonts w:ascii="Microsoft JhengHei" w:hAnsi="Microsoft JhengHei" w:eastAsia="Microsoft JhengHei" w:cs="Microsoft JhengHei"/>
-          <w:b w:val="0"/>
-          <w:color w:val="334155"/>
-          <w:sz w:val="24"/>
-        </w:rPr>
-        <w:t>：D+20 中長線預測在四項獨立檢定下成立、邊界明確、重新訓練節奏可追蹤；下一步是 POC 試運行加 PSI 自動回報的工程落地。</w:t>
-      </w:r>
-    </w:p>
-    <w:p>
-      <w:pPr>
-        <w:spacing w:after="200" w:before="360" w:line="288" w:lineRule="auto"/>
+        <w:spacing w:after="160" w:before="280" w:line="288" w:lineRule="auto"/>
       </w:pPr>
       <w:r>
         <w:rPr>
@@ -1736,7 +977,7 @@
     </w:p>
     <w:p>
       <w:pPr>
-        <w:spacing w:after="200" w:before="0" w:line="408" w:lineRule="auto"/>
+        <w:spacing w:after="160" w:before="0" w:line="408" w:lineRule="auto"/>
         <w:ind w:firstLine="454"/>
       </w:pPr>
       <w:r>
@@ -1769,7 +1010,7 @@
     </w:p>
     <w:p>
       <w:pPr>
-        <w:spacing w:after="200" w:before="0" w:line="408" w:lineRule="auto"/>
+        <w:spacing w:after="160" w:before="0" w:line="408" w:lineRule="auto"/>
         <w:ind w:firstLine="454"/>
       </w:pPr>
       <w:r>
@@ -1779,12 +1020,12 @@
           <w:color w:val="334155"/>
           <w:sz w:val="24"/>
         </w:rPr>
-        <w:t>948,976 樣本、91 預測特徵、Walk-Forward Purged K-Fold + 20 日 embargo；OOS AUC 0.6455、Top 1% 命中 36.81%、24 個月 CAGR +36.8%、9 / 9 治理關卡全數通過。從資料、模型、回測到治理已形成完整閉環。</w:t>
+        <w:t>OOS AUC 0.6455、Top 1% 命中 36.81%、24 個月 CAGR +36.8%、9 / 9 治理關卡全數通過——從資料、模型、回測到治理已形成完整閉環。</w:t>
       </w:r>
     </w:p>
     <w:p>
       <w:pPr>
-        <w:spacing w:after="200" w:before="0" w:line="408" w:lineRule="auto"/>
+        <w:spacing w:after="160" w:before="0" w:line="408" w:lineRule="auto"/>
         <w:ind w:firstLine="454"/>
       </w:pPr>
       <w:r>

</xml_diff>